<commit_message>
Added Digital Signature functionalities
</commit_message>
<xml_diff>
--- a/cases/templates/acte/ordonanta_clasare.docx
+++ b/cases/templates/acte/ordonanta_clasare.docx
@@ -4,138 +4,211 @@
   <w:body>
     <w:p>
       <w:pPr>
-        <w:rPr>
-          <w:rFonts w:ascii="Times New Roman" w:hAnsi="Times New Roman" w:cs="Times New Roman"/>
-          <w:b/>
-          <w:bCs/>
-        </w:rPr>
-      </w:pPr>
-      <w:r>
-        <w:rPr>
-          <w:rFonts w:ascii="Times New Roman" w:hAnsi="Times New Roman" w:cs="Times New Roman"/>
-          <w:b/>
-          <w:bCs/>
-        </w:rPr>
-        <w:t>ANTET PARCHETUL DE PE LÂNGĂ JUDECĂTORIA XYZ</w:t>
+        <w:spacing w:line="240" w:lineRule="auto"/>
+        <w:ind w:right="733"/>
+        <w:jc w:val="both"/>
+        <w:rPr>
+          <w:rFonts w:ascii="Times New Roman" w:hAnsi="Times New Roman" w:cs="Times New Roman"/>
+          <w:b/>
+          <w:bCs/>
+        </w:rPr>
+      </w:pPr>
+      <w:r>
+        <w:rPr>
+          <w:rFonts w:ascii="Times New Roman" w:hAnsi="Times New Roman" w:cs="Times New Roman"/>
+          <w:b/>
+          <w:bCs/>
+          <w:noProof/>
+        </w:rPr>
+        <w:drawing>
+          <wp:inline distT="0" distB="0" distL="0" distR="0" wp14:anchorId="039B3564" wp14:editId="1C99586C">
+            <wp:extent cx="1082040" cy="721360"/>
+            <wp:effectExtent l="0" t="0" r="0" b="0"/>
+            <wp:docPr id="635756682" name="Picture 1"/>
+            <wp:cNvGraphicFramePr>
+              <a:graphicFrameLocks xmlns:a="http://schemas.openxmlformats.org/drawingml/2006/main" noChangeAspect="1"/>
+            </wp:cNvGraphicFramePr>
+            <a:graphic xmlns:a="http://schemas.openxmlformats.org/drawingml/2006/main">
+              <a:graphicData uri="http://schemas.openxmlformats.org/drawingml/2006/picture">
+                <pic:pic xmlns:pic="http://schemas.openxmlformats.org/drawingml/2006/picture">
+                  <pic:nvPicPr>
+                    <pic:cNvPr id="635756682" name="Picture 635756682"/>
+                    <pic:cNvPicPr/>
+                  </pic:nvPicPr>
+                  <pic:blipFill>
+                    <a:blip r:embed="rId5" cstate="print">
+                      <a:extLst>
+                        <a:ext uri="{28A0092B-C50C-407E-A947-70E740481C1C}">
+                          <a14:useLocalDpi xmlns:a14="http://schemas.microsoft.com/office/drawing/2010/main" val="0"/>
+                        </a:ext>
+                      </a:extLst>
+                    </a:blip>
+                    <a:stretch>
+                      <a:fillRect/>
+                    </a:stretch>
+                  </pic:blipFill>
+                  <pic:spPr>
+                    <a:xfrm>
+                      <a:off x="0" y="0"/>
+                      <a:ext cx="1082040" cy="721360"/>
+                    </a:xfrm>
+                    <a:prstGeom prst="rect">
+                      <a:avLst/>
+                    </a:prstGeom>
+                  </pic:spPr>
+                </pic:pic>
+              </a:graphicData>
+            </a:graphic>
+          </wp:inline>
+        </w:drawing>
       </w:r>
     </w:p>
     <w:p>
       <w:pPr>
-        <w:rPr>
-          <w:rFonts w:ascii="Times New Roman" w:hAnsi="Times New Roman" w:cs="Times New Roman"/>
-          <w:b/>
-          <w:bCs/>
-        </w:rPr>
-      </w:pPr>
-      <w:proofErr w:type="spellStart"/>
-      <w:r>
-        <w:rPr>
-          <w:rFonts w:ascii="Times New Roman" w:hAnsi="Times New Roman" w:cs="Times New Roman"/>
-          <w:b/>
-          <w:bCs/>
-        </w:rPr>
-        <w:t>Dosarul</w:t>
-      </w:r>
-      <w:proofErr w:type="spellEnd"/>
-      <w:r>
-        <w:rPr>
-          <w:rFonts w:ascii="Times New Roman" w:hAnsi="Times New Roman" w:cs="Times New Roman"/>
-          <w:b/>
-          <w:bCs/>
-        </w:rPr>
-        <w:t xml:space="preserve"> penal nr. </w:t>
-      </w:r>
-      <w:proofErr w:type="gramStart"/>
-      <w:r>
-        <w:rPr>
-          <w:rFonts w:ascii="Times New Roman" w:hAnsi="Times New Roman" w:cs="Times New Roman"/>
-          <w:b/>
-          <w:bCs/>
-        </w:rPr>
-        <w:t xml:space="preserve">{{ </w:t>
-      </w:r>
-      <w:proofErr w:type="spellStart"/>
-      <w:r>
-        <w:rPr>
-          <w:rFonts w:ascii="Times New Roman" w:hAnsi="Times New Roman" w:cs="Times New Roman"/>
-          <w:b/>
-          <w:bCs/>
-        </w:rPr>
-        <w:t>numar</w:t>
-      </w:r>
-      <w:proofErr w:type="gramEnd"/>
-      <w:r>
-        <w:rPr>
-          <w:rFonts w:ascii="Times New Roman" w:hAnsi="Times New Roman" w:cs="Times New Roman"/>
-          <w:b/>
-          <w:bCs/>
-        </w:rPr>
-        <w:t>_</w:t>
-      </w:r>
-      <w:proofErr w:type="gramStart"/>
-      <w:r>
-        <w:rPr>
-          <w:rFonts w:ascii="Times New Roman" w:hAnsi="Times New Roman" w:cs="Times New Roman"/>
-          <w:b/>
-          <w:bCs/>
-        </w:rPr>
-        <w:t>dosar</w:t>
-      </w:r>
-      <w:proofErr w:type="spellEnd"/>
-      <w:r>
-        <w:rPr>
-          <w:rFonts w:ascii="Times New Roman" w:hAnsi="Times New Roman" w:cs="Times New Roman"/>
-          <w:b/>
-          <w:bCs/>
-        </w:rPr>
-        <w:t xml:space="preserve"> }</w:t>
-      </w:r>
-      <w:proofErr w:type="gramEnd"/>
-      <w:r>
-        <w:rPr>
-          <w:rFonts w:ascii="Times New Roman" w:hAnsi="Times New Roman" w:cs="Times New Roman"/>
-          <w:b/>
-          <w:bCs/>
-        </w:rPr>
-        <w:t>}</w:t>
-      </w:r>
+        <w:spacing w:line="240" w:lineRule="auto"/>
+        <w:ind w:right="134"/>
+        <w:jc w:val="both"/>
+        <w:rPr>
+          <w:rFonts w:ascii="Times New Roman" w:hAnsi="Times New Roman" w:cs="Times New Roman"/>
+          <w:b/>
+          <w:bCs/>
+        </w:rPr>
+      </w:pPr>
     </w:p>
     <w:p>
       <w:pPr>
-        <w:rPr>
-          <w:rFonts w:ascii="Times New Roman" w:hAnsi="Times New Roman" w:cs="Times New Roman"/>
-          <w:b/>
-          <w:bCs/>
-        </w:rPr>
-      </w:pPr>
+        <w:spacing w:line="240" w:lineRule="auto"/>
+        <w:ind w:right="134"/>
+        <w:jc w:val="both"/>
+        <w:rPr>
+          <w:rFonts w:ascii="Times New Roman" w:hAnsi="Times New Roman" w:cs="Times New Roman"/>
+          <w:b/>
+          <w:bCs/>
+        </w:rPr>
+        <w:sectPr>
+          <w:pgSz w:w="11906" w:h="16838" w:code="9"/>
+          <w:pgMar w:top="540" w:right="1080" w:bottom="1440" w:left="1080" w:header="720" w:footer="720" w:gutter="0"/>
+          <w:cols w:num="2" w:space="144" w:equalWidth="0">
+            <w:col w:w="1584" w:space="144"/>
+            <w:col w:w="8018"/>
+          </w:cols>
+          <w:docGrid w:linePitch="360"/>
+        </w:sectPr>
+      </w:pPr>
+      <w:r>
+        <w:rPr>
+          <w:rFonts w:ascii="Times New Roman" w:hAnsi="Times New Roman" w:cs="Times New Roman"/>
+          <w:b/>
+          <w:bCs/>
+        </w:rPr>
+        <w:t>PARCHETUL DE PE LÂNGĂ JUDECĂTORIA DOBÂRLĂU</w:t>
+      </w:r>
     </w:p>
     <w:p>
       <w:pPr>
-        <w:jc w:val="center"/>
-        <w:rPr>
-          <w:rFonts w:ascii="Times New Roman" w:hAnsi="Times New Roman" w:cs="Times New Roman"/>
-          <w:b/>
-          <w:bCs/>
-        </w:rPr>
-      </w:pPr>
-      <w:r>
-        <w:rPr>
-          <w:rFonts w:ascii="Times New Roman" w:hAnsi="Times New Roman" w:cs="Times New Roman"/>
-          <w:b/>
-          <w:bCs/>
-        </w:rPr>
-        <w:t>ORDONANȚĂ DE CLASARE</w:t>
+        <w:spacing w:line="240" w:lineRule="auto"/>
+        <w:jc w:val="both"/>
+        <w:rPr>
+          <w:rFonts w:ascii="Times New Roman" w:hAnsi="Times New Roman" w:cs="Times New Roman"/>
+          <w:b/>
+          <w:bCs/>
+        </w:rPr>
+      </w:pPr>
+      <w:r>
+        <w:rPr>
+          <w:rFonts w:ascii="Times New Roman" w:hAnsi="Times New Roman" w:cs="Times New Roman"/>
+          <w:b/>
+          <w:bCs/>
+          <w:noProof/>
+        </w:rPr>
+        <mc:AlternateContent>
+          <mc:Choice Requires="wps">
+            <w:drawing>
+              <wp:anchor distT="0" distB="0" distL="114300" distR="114300" simplePos="0" relativeHeight="251659264" behindDoc="0" locked="0" layoutInCell="1" allowOverlap="1" wp14:anchorId="0ABAD604" wp14:editId="7A32C116">
+                <wp:simplePos x="0" y="0"/>
+                <wp:positionH relativeFrom="column">
+                  <wp:posOffset>53340</wp:posOffset>
+                </wp:positionH>
+                <wp:positionV relativeFrom="paragraph">
+                  <wp:posOffset>63500</wp:posOffset>
+                </wp:positionV>
+                <wp:extent cx="6225540" cy="7620"/>
+                <wp:effectExtent l="0" t="0" r="22860" b="30480"/>
+                <wp:wrapNone/>
+                <wp:docPr id="1860019955" name="Straight Connector 2"/>
+                <wp:cNvGraphicFramePr/>
+                <a:graphic xmlns:a="http://schemas.openxmlformats.org/drawingml/2006/main">
+                  <a:graphicData uri="http://schemas.microsoft.com/office/word/2010/wordprocessingShape">
+                    <wps:wsp>
+                      <wps:cNvCnPr/>
+                      <wps:spPr>
+                        <a:xfrm>
+                          <a:off x="0" y="0"/>
+                          <a:ext cx="6225540" cy="7620"/>
+                        </a:xfrm>
+                        <a:prstGeom prst="line">
+                          <a:avLst/>
+                        </a:prstGeom>
+                      </wps:spPr>
+                      <wps:style>
+                        <a:lnRef idx="2">
+                          <a:schemeClr val="accent1"/>
+                        </a:lnRef>
+                        <a:fillRef idx="0">
+                          <a:schemeClr val="accent1"/>
+                        </a:fillRef>
+                        <a:effectRef idx="1">
+                          <a:schemeClr val="accent1"/>
+                        </a:effectRef>
+                        <a:fontRef idx="minor">
+                          <a:schemeClr val="tx1"/>
+                        </a:fontRef>
+                      </wps:style>
+                      <wps:bodyPr/>
+                    </wps:wsp>
+                  </a:graphicData>
+                </a:graphic>
+              </wp:anchor>
+            </w:drawing>
+          </mc:Choice>
+          <mc:Fallback>
+            <w:pict>
+              <v:line w14:anchorId="625FCF47" id="Straight Connector 2" o:spid="_x0000_s1026" style="position:absolute;z-index:251659264;visibility:visible;mso-wrap-style:square;mso-wrap-distance-left:9pt;mso-wrap-distance-top:0;mso-wrap-distance-right:9pt;mso-wrap-distance-bottom:0;mso-position-horizontal:absolute;mso-position-horizontal-relative:text;mso-position-vertical:absolute;mso-position-vertical-relative:text" from="4.2pt,5pt" to="494.4pt,5.6pt" o:gfxdata="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" strokecolor="#156082 [3204]" strokeweight="1.5pt">
+                <v:stroke joinstyle="miter"/>
+              </v:line>
+            </w:pict>
+          </mc:Fallback>
+        </mc:AlternateContent>
       </w:r>
     </w:p>
     <w:p>
       <w:pPr>
-        <w:jc w:val="center"/>
-        <w:rPr>
-          <w:rFonts w:ascii="Times New Roman" w:hAnsi="Times New Roman" w:cs="Times New Roman"/>
-          <w:b/>
-          <w:bCs/>
-        </w:rPr>
-      </w:pPr>
+        <w:spacing w:line="240" w:lineRule="auto"/>
+        <w:jc w:val="both"/>
+        <w:rPr>
+          <w:rFonts w:ascii="Times New Roman" w:hAnsi="Times New Roman" w:cs="Times New Roman"/>
+          <w:b/>
+          <w:bCs/>
+        </w:rPr>
+      </w:pPr>
+      <w:proofErr w:type="spellStart"/>
+      <w:r>
+        <w:rPr>
+          <w:rFonts w:ascii="Times New Roman" w:hAnsi="Times New Roman" w:cs="Times New Roman"/>
+          <w:b/>
+          <w:bCs/>
+        </w:rPr>
+        <w:t>Dosar</w:t>
+      </w:r>
+      <w:proofErr w:type="spellEnd"/>
+      <w:r>
+        <w:rPr>
+          <w:rFonts w:ascii="Times New Roman" w:hAnsi="Times New Roman" w:cs="Times New Roman"/>
+          <w:b/>
+          <w:bCs/>
+        </w:rPr>
+        <w:t xml:space="preserve"> nr. </w:t>
+      </w:r>
       <w:proofErr w:type="gramStart"/>
       <w:r>
         <w:rPr>
@@ -152,7 +225,7 @@
           <w:b/>
           <w:bCs/>
         </w:rPr>
-        <w:t>data</w:t>
+        <w:t>numar</w:t>
       </w:r>
       <w:proofErr w:type="gramEnd"/>
       <w:r>
@@ -170,7 +243,7 @@
           <w:b/>
           <w:bCs/>
         </w:rPr>
-        <w:t>actului</w:t>
+        <w:t>dosar</w:t>
       </w:r>
       <w:proofErr w:type="spellEnd"/>
       <w:r>
@@ -193,6 +266,8 @@
     </w:p>
     <w:p>
       <w:pPr>
+        <w:spacing w:line="240" w:lineRule="auto"/>
+        <w:jc w:val="both"/>
         <w:rPr>
           <w:rFonts w:ascii="Times New Roman" w:hAnsi="Times New Roman" w:cs="Times New Roman"/>
           <w:b/>
@@ -202,916 +277,389 @@
     </w:p>
     <w:p>
       <w:pPr>
-        <w:ind w:firstLine="720"/>
-        <w:rPr>
-          <w:rFonts w:ascii="Times New Roman" w:hAnsi="Times New Roman" w:cs="Times New Roman"/>
-          <w:b/>
-          <w:bCs/>
-        </w:rPr>
-      </w:pPr>
-      <w:proofErr w:type="gramStart"/>
-      <w:r>
-        <w:rPr>
-          <w:rFonts w:ascii="Times New Roman" w:hAnsi="Times New Roman" w:cs="Times New Roman"/>
-          <w:b/>
-          <w:bCs/>
-        </w:rPr>
-        <w:t xml:space="preserve">{{ </w:t>
-      </w:r>
-      <w:proofErr w:type="spellStart"/>
-      <w:r>
-        <w:rPr>
-          <w:rFonts w:ascii="Times New Roman" w:hAnsi="Times New Roman" w:cs="Times New Roman"/>
-          <w:b/>
-          <w:bCs/>
-        </w:rPr>
-        <w:t>functie</w:t>
-      </w:r>
-      <w:proofErr w:type="spellEnd"/>
-      <w:proofErr w:type="gramEnd"/>
-      <w:r>
-        <w:rPr>
-          <w:rFonts w:ascii="Times New Roman" w:hAnsi="Times New Roman" w:cs="Times New Roman"/>
-          <w:b/>
-          <w:bCs/>
-        </w:rPr>
-        <w:t xml:space="preserve"> }}, </w:t>
-      </w:r>
-      <w:proofErr w:type="gramStart"/>
-      <w:r>
-        <w:rPr>
-          <w:rFonts w:ascii="Times New Roman" w:hAnsi="Times New Roman" w:cs="Times New Roman"/>
-          <w:b/>
-          <w:bCs/>
-        </w:rPr>
-        <w:t xml:space="preserve">{{ </w:t>
-      </w:r>
-      <w:proofErr w:type="spellStart"/>
-      <w:r>
-        <w:rPr>
-          <w:rFonts w:ascii="Times New Roman" w:hAnsi="Times New Roman" w:cs="Times New Roman"/>
-          <w:b/>
-          <w:bCs/>
-        </w:rPr>
-        <w:t>nume</w:t>
-      </w:r>
-      <w:proofErr w:type="gramEnd"/>
-      <w:r>
-        <w:rPr>
-          <w:rFonts w:ascii="Times New Roman" w:hAnsi="Times New Roman" w:cs="Times New Roman"/>
-          <w:b/>
-          <w:bCs/>
-        </w:rPr>
-        <w:t>_</w:t>
-      </w:r>
-      <w:proofErr w:type="gramStart"/>
-      <w:r>
-        <w:rPr>
-          <w:rFonts w:ascii="Times New Roman" w:hAnsi="Times New Roman" w:cs="Times New Roman"/>
-          <w:b/>
-          <w:bCs/>
-        </w:rPr>
-        <w:t>semnatar</w:t>
-      </w:r>
-      <w:proofErr w:type="spellEnd"/>
-      <w:r>
-        <w:rPr>
-          <w:rFonts w:ascii="Times New Roman" w:hAnsi="Times New Roman" w:cs="Times New Roman"/>
-          <w:b/>
-          <w:bCs/>
-        </w:rPr>
-        <w:t xml:space="preserve"> }</w:t>
-      </w:r>
-      <w:proofErr w:type="gramEnd"/>
-      <w:r>
-        <w:rPr>
-          <w:rFonts w:ascii="Times New Roman" w:hAnsi="Times New Roman" w:cs="Times New Roman"/>
-          <w:b/>
-          <w:bCs/>
-        </w:rPr>
-        <w:t xml:space="preserve">} din </w:t>
-      </w:r>
-      <w:proofErr w:type="spellStart"/>
-      <w:r>
-        <w:rPr>
-          <w:rFonts w:ascii="Times New Roman" w:hAnsi="Times New Roman" w:cs="Times New Roman"/>
-          <w:b/>
-          <w:bCs/>
-        </w:rPr>
-        <w:t>cadrul</w:t>
-      </w:r>
-      <w:proofErr w:type="spellEnd"/>
-      <w:r>
-        <w:rPr>
-          <w:rFonts w:ascii="Times New Roman" w:hAnsi="Times New Roman" w:cs="Times New Roman"/>
-          <w:b/>
-          <w:bCs/>
-        </w:rPr>
-        <w:t xml:space="preserve"> </w:t>
-      </w:r>
-      <w:proofErr w:type="gramStart"/>
-      <w:r>
-        <w:rPr>
-          <w:rFonts w:ascii="Times New Roman" w:hAnsi="Times New Roman" w:cs="Times New Roman"/>
-          <w:b/>
-          <w:bCs/>
-        </w:rPr>
-        <w:t xml:space="preserve">{{ </w:t>
-      </w:r>
-      <w:proofErr w:type="spellStart"/>
-      <w:r>
-        <w:rPr>
-          <w:rFonts w:ascii="Times New Roman" w:hAnsi="Times New Roman" w:cs="Times New Roman"/>
-          <w:b/>
-          <w:bCs/>
-        </w:rPr>
-        <w:t>unitate</w:t>
-      </w:r>
-      <w:proofErr w:type="spellEnd"/>
-      <w:proofErr w:type="gramEnd"/>
-      <w:r>
-        <w:rPr>
-          <w:rFonts w:ascii="Times New Roman" w:hAnsi="Times New Roman" w:cs="Times New Roman"/>
-          <w:b/>
-          <w:bCs/>
-        </w:rPr>
-        <w:t xml:space="preserve"> }},</w:t>
+        <w:spacing w:line="240" w:lineRule="auto"/>
+        <w:jc w:val="center"/>
+        <w:rPr>
+          <w:rFonts w:ascii="Times New Roman" w:hAnsi="Times New Roman" w:cs="Times New Roman"/>
+          <w:b/>
+          <w:bCs/>
+        </w:rPr>
+      </w:pPr>
+      <w:r>
+        <w:rPr>
+          <w:rFonts w:ascii="Times New Roman" w:hAnsi="Times New Roman" w:cs="Times New Roman"/>
+          <w:b/>
+          <w:bCs/>
+        </w:rPr>
+        <w:t>ORDONANȚĂ DE CLASARE</w:t>
       </w:r>
     </w:p>
     <w:p>
       <w:pPr>
-        <w:ind w:firstLine="720"/>
-        <w:rPr>
-          <w:rFonts w:ascii="Times New Roman" w:hAnsi="Times New Roman" w:cs="Times New Roman"/>
-          <w:b/>
-          <w:bCs/>
-        </w:rPr>
-      </w:pPr>
+        <w:spacing w:line="240" w:lineRule="auto"/>
+        <w:jc w:val="center"/>
+        <w:rPr>
+          <w:rFonts w:ascii="Times New Roman" w:hAnsi="Times New Roman" w:cs="Times New Roman"/>
+          <w:b/>
+          <w:bCs/>
+        </w:rPr>
+      </w:pPr>
+      <w:proofErr w:type="gramStart"/>
+      <w:r>
+        <w:rPr>
+          <w:rFonts w:ascii="Times New Roman" w:hAnsi="Times New Roman" w:cs="Times New Roman"/>
+          <w:b/>
+          <w:bCs/>
+        </w:rPr>
+        <w:t xml:space="preserve">{{ </w:t>
+      </w:r>
+      <w:proofErr w:type="spellStart"/>
+      <w:r>
+        <w:rPr>
+          <w:rFonts w:ascii="Times New Roman" w:hAnsi="Times New Roman" w:cs="Times New Roman"/>
+          <w:b/>
+          <w:bCs/>
+        </w:rPr>
+        <w:t>data</w:t>
+      </w:r>
+      <w:proofErr w:type="gramEnd"/>
+      <w:r>
+        <w:rPr>
+          <w:rFonts w:ascii="Times New Roman" w:hAnsi="Times New Roman" w:cs="Times New Roman"/>
+          <w:b/>
+          <w:bCs/>
+        </w:rPr>
+        <w:t>_</w:t>
+      </w:r>
+      <w:proofErr w:type="gramStart"/>
+      <w:r>
+        <w:rPr>
+          <w:rFonts w:ascii="Times New Roman" w:hAnsi="Times New Roman" w:cs="Times New Roman"/>
+          <w:b/>
+          <w:bCs/>
+        </w:rPr>
+        <w:t>actului</w:t>
+      </w:r>
+      <w:proofErr w:type="spellEnd"/>
+      <w:r>
+        <w:rPr>
+          <w:rFonts w:ascii="Times New Roman" w:hAnsi="Times New Roman" w:cs="Times New Roman"/>
+          <w:b/>
+          <w:bCs/>
+        </w:rPr>
+        <w:t xml:space="preserve"> }</w:t>
+      </w:r>
+      <w:proofErr w:type="gramEnd"/>
+      <w:r>
+        <w:rPr>
+          <w:rFonts w:ascii="Times New Roman" w:hAnsi="Times New Roman" w:cs="Times New Roman"/>
+          <w:b/>
+          <w:bCs/>
+        </w:rPr>
+        <w:t>}</w:t>
+      </w:r>
     </w:p>
     <w:p>
       <w:pPr>
-        <w:jc w:val="center"/>
-        <w:rPr>
-          <w:rFonts w:ascii="Times New Roman" w:hAnsi="Times New Roman" w:cs="Times New Roman"/>
-          <w:b/>
-          <w:bCs/>
-        </w:rPr>
-      </w:pPr>
-      <w:r>
-        <w:rPr>
-          <w:rFonts w:ascii="Times New Roman" w:hAnsi="Times New Roman" w:cs="Times New Roman"/>
-          <w:b/>
-          <w:bCs/>
-        </w:rPr>
-        <w:t>CONSTAT:</w:t>
-      </w:r>
+        <w:spacing w:line="240" w:lineRule="auto"/>
+        <w:jc w:val="both"/>
+        <w:rPr>
+          <w:rFonts w:ascii="Times New Roman" w:hAnsi="Times New Roman" w:cs="Times New Roman"/>
+          <w:b/>
+          <w:bCs/>
+        </w:rPr>
+      </w:pPr>
     </w:p>
     <w:p>
       <w:pPr>
-        <w:jc w:val="center"/>
-        <w:rPr>
-          <w:rFonts w:ascii="Times New Roman" w:hAnsi="Times New Roman" w:cs="Times New Roman"/>
-          <w:b/>
-          <w:bCs/>
-        </w:rPr>
-      </w:pPr>
+        <w:spacing w:line="240" w:lineRule="auto"/>
+        <w:ind w:firstLine="720"/>
+        <w:jc w:val="both"/>
+        <w:rPr>
+          <w:rFonts w:ascii="Times New Roman" w:hAnsi="Times New Roman" w:cs="Times New Roman"/>
+          <w:b/>
+          <w:bCs/>
+        </w:rPr>
+      </w:pPr>
+      <w:proofErr w:type="gramStart"/>
+      <w:r>
+        <w:rPr>
+          <w:rFonts w:ascii="Times New Roman" w:hAnsi="Times New Roman" w:cs="Times New Roman"/>
+        </w:rPr>
+        <w:t xml:space="preserve">{{ </w:t>
+      </w:r>
+      <w:proofErr w:type="spellStart"/>
+      <w:r>
+        <w:rPr>
+          <w:rFonts w:ascii="Times New Roman" w:hAnsi="Times New Roman" w:cs="Times New Roman"/>
+        </w:rPr>
+        <w:t>functie</w:t>
+      </w:r>
+      <w:proofErr w:type="spellEnd"/>
+      <w:proofErr w:type="gramEnd"/>
+      <w:r>
+        <w:rPr>
+          <w:rFonts w:ascii="Times New Roman" w:hAnsi="Times New Roman" w:cs="Times New Roman"/>
+        </w:rPr>
+        <w:t xml:space="preserve"> }}</w:t>
+      </w:r>
+      <w:r>
+        <w:rPr>
+          <w:rFonts w:ascii="Times New Roman" w:hAnsi="Times New Roman" w:cs="Times New Roman"/>
+          <w:b/>
+          <w:bCs/>
+        </w:rPr>
+        <w:t xml:space="preserve"> </w:t>
+      </w:r>
+      <w:proofErr w:type="gramStart"/>
+      <w:r>
+        <w:rPr>
+          <w:rFonts w:ascii="Times New Roman" w:hAnsi="Times New Roman" w:cs="Times New Roman"/>
+          <w:b/>
+          <w:bCs/>
+        </w:rPr>
+        <w:t xml:space="preserve">{{ </w:t>
+      </w:r>
+      <w:proofErr w:type="spellStart"/>
+      <w:r>
+        <w:rPr>
+          <w:rFonts w:ascii="Times New Roman" w:hAnsi="Times New Roman" w:cs="Times New Roman"/>
+          <w:b/>
+          <w:bCs/>
+        </w:rPr>
+        <w:t>nume</w:t>
+      </w:r>
+      <w:proofErr w:type="gramEnd"/>
+      <w:r>
+        <w:rPr>
+          <w:rFonts w:ascii="Times New Roman" w:hAnsi="Times New Roman" w:cs="Times New Roman"/>
+          <w:b/>
+          <w:bCs/>
+        </w:rPr>
+        <w:t>_</w:t>
+      </w:r>
+      <w:proofErr w:type="gramStart"/>
+      <w:r>
+        <w:rPr>
+          <w:rFonts w:ascii="Times New Roman" w:hAnsi="Times New Roman" w:cs="Times New Roman"/>
+          <w:b/>
+          <w:bCs/>
+        </w:rPr>
+        <w:t>semnatar</w:t>
+      </w:r>
+      <w:proofErr w:type="spellEnd"/>
+      <w:r>
+        <w:rPr>
+          <w:rFonts w:ascii="Times New Roman" w:hAnsi="Times New Roman" w:cs="Times New Roman"/>
+          <w:b/>
+          <w:bCs/>
+        </w:rPr>
+        <w:t xml:space="preserve"> }</w:t>
+      </w:r>
+      <w:proofErr w:type="gramEnd"/>
+      <w:r>
+        <w:rPr>
+          <w:rFonts w:ascii="Times New Roman" w:hAnsi="Times New Roman" w:cs="Times New Roman"/>
+          <w:b/>
+          <w:bCs/>
+        </w:rPr>
+        <w:t xml:space="preserve">} </w:t>
+      </w:r>
+      <w:r>
+        <w:rPr>
+          <w:rFonts w:ascii="Times New Roman" w:hAnsi="Times New Roman" w:cs="Times New Roman"/>
+        </w:rPr>
+        <w:t xml:space="preserve">din </w:t>
+      </w:r>
+      <w:proofErr w:type="spellStart"/>
+      <w:r>
+        <w:rPr>
+          <w:rFonts w:ascii="Times New Roman" w:hAnsi="Times New Roman" w:cs="Times New Roman"/>
+        </w:rPr>
+        <w:t>cadrul</w:t>
+      </w:r>
+      <w:proofErr w:type="spellEnd"/>
+      <w:r>
+        <w:rPr>
+          <w:rFonts w:ascii="Times New Roman" w:hAnsi="Times New Roman" w:cs="Times New Roman"/>
+        </w:rPr>
+        <w:t xml:space="preserve"> </w:t>
+      </w:r>
+      <w:proofErr w:type="gramStart"/>
+      <w:r>
+        <w:rPr>
+          <w:rFonts w:ascii="Times New Roman" w:hAnsi="Times New Roman" w:cs="Times New Roman"/>
+        </w:rPr>
+        <w:t xml:space="preserve">{{ </w:t>
+      </w:r>
+      <w:proofErr w:type="spellStart"/>
+      <w:r>
+        <w:rPr>
+          <w:rFonts w:ascii="Times New Roman" w:hAnsi="Times New Roman" w:cs="Times New Roman"/>
+        </w:rPr>
+        <w:t>unitate</w:t>
+      </w:r>
+      <w:proofErr w:type="spellEnd"/>
+      <w:proofErr w:type="gramEnd"/>
+      <w:r>
+        <w:rPr>
+          <w:rFonts w:ascii="Times New Roman" w:hAnsi="Times New Roman" w:cs="Times New Roman"/>
+        </w:rPr>
+        <w:t xml:space="preserve"> }},</w:t>
+      </w:r>
     </w:p>
     <w:p>
       <w:pPr>
+        <w:spacing w:line="240" w:lineRule="auto"/>
         <w:ind w:firstLine="720"/>
-        <w:rPr>
-          <w:rFonts w:ascii="Times New Roman" w:hAnsi="Times New Roman" w:cs="Times New Roman"/>
-          <w:b/>
-          <w:bCs/>
-        </w:rPr>
-      </w:pPr>
-      <w:r>
-        <w:rPr>
-          <w:rFonts w:ascii="Times New Roman" w:hAnsi="Times New Roman" w:cs="Times New Roman"/>
-          <w:b/>
-          <w:bCs/>
-        </w:rPr>
-        <w:t xml:space="preserve">La data de </w:t>
-      </w:r>
-      <w:proofErr w:type="gramStart"/>
-      <w:r>
-        <w:rPr>
-          <w:rFonts w:ascii="Times New Roman" w:hAnsi="Times New Roman" w:cs="Times New Roman"/>
-          <w:b/>
-          <w:bCs/>
-        </w:rPr>
-        <w:t xml:space="preserve">{{ </w:t>
-      </w:r>
-      <w:proofErr w:type="spellStart"/>
-      <w:r>
-        <w:rPr>
-          <w:rFonts w:ascii="Times New Roman" w:hAnsi="Times New Roman" w:cs="Times New Roman"/>
-          <w:b/>
-          <w:bCs/>
-        </w:rPr>
-        <w:t>data</w:t>
-      </w:r>
-      <w:proofErr w:type="gramEnd"/>
-      <w:r>
-        <w:rPr>
-          <w:rFonts w:ascii="Times New Roman" w:hAnsi="Times New Roman" w:cs="Times New Roman"/>
-          <w:b/>
-          <w:bCs/>
-        </w:rPr>
-        <w:t>_</w:t>
-      </w:r>
-      <w:proofErr w:type="gramStart"/>
-      <w:r>
-        <w:rPr>
-          <w:rFonts w:ascii="Times New Roman" w:hAnsi="Times New Roman" w:cs="Times New Roman"/>
-          <w:b/>
-          <w:bCs/>
-        </w:rPr>
-        <w:t>inregistrarii</w:t>
-      </w:r>
-      <w:proofErr w:type="spellEnd"/>
-      <w:r>
-        <w:rPr>
-          <w:rFonts w:ascii="Times New Roman" w:hAnsi="Times New Roman" w:cs="Times New Roman"/>
-          <w:b/>
-          <w:bCs/>
-        </w:rPr>
-        <w:t xml:space="preserve"> }</w:t>
-      </w:r>
-      <w:proofErr w:type="gramEnd"/>
-      <w:r>
-        <w:rPr>
-          <w:rFonts w:ascii="Times New Roman" w:hAnsi="Times New Roman" w:cs="Times New Roman"/>
-          <w:b/>
-          <w:bCs/>
-        </w:rPr>
-        <w:t xml:space="preserve">} a </w:t>
-      </w:r>
-      <w:proofErr w:type="spellStart"/>
-      <w:r>
-        <w:rPr>
-          <w:rFonts w:ascii="Times New Roman" w:hAnsi="Times New Roman" w:cs="Times New Roman"/>
-          <w:b/>
-          <w:bCs/>
-        </w:rPr>
-        <w:t>fost</w:t>
-      </w:r>
-      <w:proofErr w:type="spellEnd"/>
-      <w:r>
-        <w:rPr>
-          <w:rFonts w:ascii="Times New Roman" w:hAnsi="Times New Roman" w:cs="Times New Roman"/>
-          <w:b/>
-          <w:bCs/>
-        </w:rPr>
-        <w:t xml:space="preserve"> </w:t>
-      </w:r>
-      <w:proofErr w:type="spellStart"/>
-      <w:r>
-        <w:rPr>
-          <w:rFonts w:ascii="Times New Roman" w:hAnsi="Times New Roman" w:cs="Times New Roman"/>
-          <w:b/>
-          <w:bCs/>
-        </w:rPr>
-        <w:t>înregistrat</w:t>
-      </w:r>
-      <w:proofErr w:type="spellEnd"/>
-      <w:r>
-        <w:rPr>
-          <w:rFonts w:ascii="Times New Roman" w:hAnsi="Times New Roman" w:cs="Times New Roman"/>
-          <w:b/>
-          <w:bCs/>
-        </w:rPr>
-        <w:t xml:space="preserve"> </w:t>
-      </w:r>
-      <w:proofErr w:type="spellStart"/>
-      <w:r>
-        <w:rPr>
-          <w:rFonts w:ascii="Times New Roman" w:hAnsi="Times New Roman" w:cs="Times New Roman"/>
-          <w:b/>
-          <w:bCs/>
-        </w:rPr>
-        <w:t>dosarul</w:t>
-      </w:r>
-      <w:proofErr w:type="spellEnd"/>
-      <w:r>
-        <w:rPr>
-          <w:rFonts w:ascii="Times New Roman" w:hAnsi="Times New Roman" w:cs="Times New Roman"/>
-          <w:b/>
-          <w:bCs/>
-        </w:rPr>
-        <w:t xml:space="preserve"> penal cu </w:t>
-      </w:r>
-      <w:proofErr w:type="spellStart"/>
-      <w:r>
-        <w:rPr>
-          <w:rFonts w:ascii="Times New Roman" w:hAnsi="Times New Roman" w:cs="Times New Roman"/>
-          <w:b/>
-          <w:bCs/>
-        </w:rPr>
-        <w:t>numărul</w:t>
-      </w:r>
-      <w:proofErr w:type="spellEnd"/>
-      <w:r>
-        <w:rPr>
-          <w:rFonts w:ascii="Times New Roman" w:hAnsi="Times New Roman" w:cs="Times New Roman"/>
-          <w:b/>
-          <w:bCs/>
-        </w:rPr>
-        <w:t xml:space="preserve"> de </w:t>
-      </w:r>
-      <w:proofErr w:type="spellStart"/>
-      <w:r>
-        <w:rPr>
-          <w:rFonts w:ascii="Times New Roman" w:hAnsi="Times New Roman" w:cs="Times New Roman"/>
-          <w:b/>
-          <w:bCs/>
-        </w:rPr>
-        <w:t>mai</w:t>
-      </w:r>
-      <w:proofErr w:type="spellEnd"/>
-      <w:r>
-        <w:rPr>
-          <w:rFonts w:ascii="Times New Roman" w:hAnsi="Times New Roman" w:cs="Times New Roman"/>
-          <w:b/>
-          <w:bCs/>
-        </w:rPr>
-        <w:t xml:space="preserve"> sus. </w:t>
-      </w:r>
+        <w:jc w:val="both"/>
+        <w:rPr>
+          <w:rFonts w:ascii="Times New Roman" w:hAnsi="Times New Roman" w:cs="Times New Roman"/>
+          <w:b/>
+          <w:bCs/>
+        </w:rPr>
+      </w:pPr>
     </w:p>
     <w:p>
       <w:pPr>
-        <w:ind w:firstLine="720"/>
-        <w:rPr>
-          <w:rFonts w:ascii="Times New Roman" w:hAnsi="Times New Roman" w:cs="Times New Roman"/>
-          <w:b/>
-          <w:bCs/>
-        </w:rPr>
-      </w:pPr>
-      <w:r>
-        <w:rPr>
-          <w:rFonts w:ascii="Times New Roman" w:hAnsi="Times New Roman" w:cs="Times New Roman"/>
-          <w:b/>
-          <w:bCs/>
-        </w:rPr>
-        <w:t xml:space="preserve">Din </w:t>
-      </w:r>
-      <w:proofErr w:type="spellStart"/>
-      <w:r>
-        <w:rPr>
-          <w:rFonts w:ascii="Times New Roman" w:hAnsi="Times New Roman" w:cs="Times New Roman"/>
-          <w:b/>
-          <w:bCs/>
-        </w:rPr>
-        <w:t>cuprinsul</w:t>
-      </w:r>
-      <w:proofErr w:type="spellEnd"/>
-      <w:r>
-        <w:rPr>
-          <w:rFonts w:ascii="Times New Roman" w:hAnsi="Times New Roman" w:cs="Times New Roman"/>
-          <w:b/>
-          <w:bCs/>
-        </w:rPr>
-        <w:t xml:space="preserve"> </w:t>
-      </w:r>
-      <w:proofErr w:type="spellStart"/>
-      <w:r>
-        <w:rPr>
-          <w:rFonts w:ascii="Times New Roman" w:hAnsi="Times New Roman" w:cs="Times New Roman"/>
-          <w:b/>
-          <w:bCs/>
-        </w:rPr>
-        <w:t>actului</w:t>
-      </w:r>
-      <w:proofErr w:type="spellEnd"/>
-      <w:r>
-        <w:rPr>
-          <w:rFonts w:ascii="Times New Roman" w:hAnsi="Times New Roman" w:cs="Times New Roman"/>
-          <w:b/>
-          <w:bCs/>
-        </w:rPr>
-        <w:t xml:space="preserve"> de </w:t>
-      </w:r>
-      <w:proofErr w:type="spellStart"/>
-      <w:r>
-        <w:rPr>
-          <w:rFonts w:ascii="Times New Roman" w:hAnsi="Times New Roman" w:cs="Times New Roman"/>
-          <w:b/>
-          <w:bCs/>
-        </w:rPr>
-        <w:t>sesizare</w:t>
-      </w:r>
-      <w:proofErr w:type="spellEnd"/>
-      <w:r>
-        <w:rPr>
-          <w:rFonts w:ascii="Times New Roman" w:hAnsi="Times New Roman" w:cs="Times New Roman"/>
-          <w:b/>
-          <w:bCs/>
-        </w:rPr>
-        <w:t xml:space="preserve"> </w:t>
-      </w:r>
-      <w:proofErr w:type="spellStart"/>
-      <w:r>
-        <w:rPr>
-          <w:rFonts w:ascii="Times New Roman" w:hAnsi="Times New Roman" w:cs="Times New Roman"/>
-          <w:b/>
-          <w:bCs/>
-        </w:rPr>
-        <w:t>rezultă</w:t>
-      </w:r>
-      <w:proofErr w:type="spellEnd"/>
-      <w:r>
-        <w:rPr>
-          <w:rFonts w:ascii="Times New Roman" w:hAnsi="Times New Roman" w:cs="Times New Roman"/>
-          <w:b/>
-          <w:bCs/>
-        </w:rPr>
-        <w:t xml:space="preserve"> </w:t>
-      </w:r>
-      <w:proofErr w:type="spellStart"/>
-      <w:r>
-        <w:rPr>
-          <w:rFonts w:ascii="Times New Roman" w:hAnsi="Times New Roman" w:cs="Times New Roman"/>
-          <w:b/>
-          <w:bCs/>
-        </w:rPr>
-        <w:t>că</w:t>
-      </w:r>
-      <w:proofErr w:type="spellEnd"/>
-      <w:r>
-        <w:rPr>
-          <w:rFonts w:ascii="Times New Roman" w:hAnsi="Times New Roman" w:cs="Times New Roman"/>
-          <w:b/>
-          <w:bCs/>
-        </w:rPr>
-        <w:t xml:space="preserve"> </w:t>
-      </w:r>
-      <w:proofErr w:type="gramStart"/>
-      <w:r>
-        <w:rPr>
-          <w:rFonts w:ascii="Times New Roman" w:hAnsi="Times New Roman" w:cs="Times New Roman"/>
-          <w:b/>
-          <w:bCs/>
-        </w:rPr>
-        <w:t xml:space="preserve">{{ </w:t>
-      </w:r>
-      <w:proofErr w:type="spellStart"/>
-      <w:r>
-        <w:rPr>
-          <w:rFonts w:ascii="Times New Roman" w:hAnsi="Times New Roman" w:cs="Times New Roman"/>
-          <w:b/>
-          <w:bCs/>
-        </w:rPr>
-        <w:t>infractiune</w:t>
-      </w:r>
-      <w:proofErr w:type="gramEnd"/>
-      <w:r>
-        <w:rPr>
-          <w:rFonts w:ascii="Times New Roman" w:hAnsi="Times New Roman" w:cs="Times New Roman"/>
-          <w:b/>
-          <w:bCs/>
-        </w:rPr>
-        <w:t>_</w:t>
-      </w:r>
-      <w:proofErr w:type="gramStart"/>
-      <w:r>
-        <w:rPr>
-          <w:rFonts w:ascii="Times New Roman" w:hAnsi="Times New Roman" w:cs="Times New Roman"/>
-          <w:b/>
-          <w:bCs/>
-        </w:rPr>
-        <w:t>cercetata</w:t>
-      </w:r>
-      <w:proofErr w:type="spellEnd"/>
-      <w:r>
-        <w:rPr>
-          <w:rFonts w:ascii="Times New Roman" w:hAnsi="Times New Roman" w:cs="Times New Roman"/>
-          <w:b/>
-          <w:bCs/>
-        </w:rPr>
-        <w:t xml:space="preserve"> }</w:t>
-      </w:r>
-      <w:proofErr w:type="gramEnd"/>
-      <w:r>
-        <w:rPr>
-          <w:rFonts w:ascii="Times New Roman" w:hAnsi="Times New Roman" w:cs="Times New Roman"/>
-          <w:b/>
-          <w:bCs/>
-        </w:rPr>
-        <w:t xml:space="preserve">}. </w:t>
+        <w:spacing w:line="240" w:lineRule="auto"/>
+        <w:jc w:val="center"/>
+        <w:rPr>
+          <w:rFonts w:ascii="Times New Roman" w:hAnsi="Times New Roman" w:cs="Times New Roman"/>
+          <w:b/>
+          <w:bCs/>
+        </w:rPr>
+      </w:pPr>
+      <w:r>
+        <w:rPr>
+          <w:rFonts w:ascii="Times New Roman" w:hAnsi="Times New Roman" w:cs="Times New Roman"/>
+          <w:b/>
+          <w:bCs/>
+        </w:rPr>
+        <w:t>CONSTAT:</w:t>
       </w:r>
     </w:p>
     <w:p>
       <w:pPr>
-        <w:ind w:firstLine="720"/>
-        <w:rPr>
-          <w:rFonts w:ascii="Times New Roman" w:hAnsi="Times New Roman" w:cs="Times New Roman"/>
-          <w:b/>
-          <w:bCs/>
-        </w:rPr>
-      </w:pPr>
-      <w:r>
-        <w:rPr>
-          <w:rFonts w:ascii="Times New Roman" w:hAnsi="Times New Roman" w:cs="Times New Roman"/>
-          <w:b/>
-          <w:bCs/>
-        </w:rPr>
-        <w:t xml:space="preserve">Din </w:t>
-      </w:r>
-      <w:proofErr w:type="spellStart"/>
-      <w:r>
-        <w:rPr>
-          <w:rFonts w:ascii="Times New Roman" w:hAnsi="Times New Roman" w:cs="Times New Roman"/>
-          <w:b/>
-          <w:bCs/>
-        </w:rPr>
-        <w:t>actele</w:t>
-      </w:r>
-      <w:proofErr w:type="spellEnd"/>
-      <w:r>
-        <w:rPr>
-          <w:rFonts w:ascii="Times New Roman" w:hAnsi="Times New Roman" w:cs="Times New Roman"/>
-          <w:b/>
-          <w:bCs/>
-        </w:rPr>
-        <w:t xml:space="preserve"> de </w:t>
-      </w:r>
-      <w:proofErr w:type="spellStart"/>
-      <w:r>
-        <w:rPr>
-          <w:rFonts w:ascii="Times New Roman" w:hAnsi="Times New Roman" w:cs="Times New Roman"/>
-          <w:b/>
-          <w:bCs/>
-        </w:rPr>
-        <w:t>urmărire</w:t>
-      </w:r>
-      <w:proofErr w:type="spellEnd"/>
-      <w:r>
-        <w:rPr>
-          <w:rFonts w:ascii="Times New Roman" w:hAnsi="Times New Roman" w:cs="Times New Roman"/>
-          <w:b/>
-          <w:bCs/>
-        </w:rPr>
-        <w:t xml:space="preserve"> </w:t>
-      </w:r>
-      <w:proofErr w:type="spellStart"/>
-      <w:r>
-        <w:rPr>
-          <w:rFonts w:ascii="Times New Roman" w:hAnsi="Times New Roman" w:cs="Times New Roman"/>
-          <w:b/>
-          <w:bCs/>
-        </w:rPr>
-        <w:t>efectuate</w:t>
-      </w:r>
-      <w:proofErr w:type="spellEnd"/>
-      <w:r>
-        <w:rPr>
-          <w:rFonts w:ascii="Times New Roman" w:hAnsi="Times New Roman" w:cs="Times New Roman"/>
-          <w:b/>
-          <w:bCs/>
-        </w:rPr>
-        <w:t xml:space="preserve"> </w:t>
-      </w:r>
-      <w:proofErr w:type="spellStart"/>
-      <w:r>
-        <w:rPr>
-          <w:rFonts w:ascii="Times New Roman" w:hAnsi="Times New Roman" w:cs="Times New Roman"/>
-          <w:b/>
-          <w:bCs/>
-        </w:rPr>
-        <w:t>în</w:t>
-      </w:r>
-      <w:proofErr w:type="spellEnd"/>
-      <w:r>
-        <w:rPr>
-          <w:rFonts w:ascii="Times New Roman" w:hAnsi="Times New Roman" w:cs="Times New Roman"/>
-          <w:b/>
-          <w:bCs/>
-        </w:rPr>
-        <w:t xml:space="preserve"> </w:t>
-      </w:r>
-      <w:proofErr w:type="spellStart"/>
-      <w:r>
-        <w:rPr>
-          <w:rFonts w:ascii="Times New Roman" w:hAnsi="Times New Roman" w:cs="Times New Roman"/>
-          <w:b/>
-          <w:bCs/>
-        </w:rPr>
-        <w:t>cauză</w:t>
-      </w:r>
-      <w:proofErr w:type="spellEnd"/>
-      <w:r>
-        <w:rPr>
-          <w:rFonts w:ascii="Times New Roman" w:hAnsi="Times New Roman" w:cs="Times New Roman"/>
-          <w:b/>
-          <w:bCs/>
-        </w:rPr>
-        <w:t xml:space="preserve"> </w:t>
-      </w:r>
-      <w:proofErr w:type="spellStart"/>
-      <w:r>
-        <w:rPr>
-          <w:rFonts w:ascii="Times New Roman" w:hAnsi="Times New Roman" w:cs="Times New Roman"/>
-          <w:b/>
-          <w:bCs/>
-        </w:rPr>
-        <w:t>rezultă</w:t>
-      </w:r>
-      <w:proofErr w:type="spellEnd"/>
-      <w:r>
-        <w:rPr>
-          <w:rFonts w:ascii="Times New Roman" w:hAnsi="Times New Roman" w:cs="Times New Roman"/>
-          <w:b/>
-          <w:bCs/>
-        </w:rPr>
-        <w:t xml:space="preserve"> </w:t>
-      </w:r>
-      <w:proofErr w:type="spellStart"/>
-      <w:r>
-        <w:rPr>
-          <w:rFonts w:ascii="Times New Roman" w:hAnsi="Times New Roman" w:cs="Times New Roman"/>
-          <w:b/>
-          <w:bCs/>
-        </w:rPr>
-        <w:t>că</w:t>
-      </w:r>
-      <w:proofErr w:type="spellEnd"/>
-      <w:r>
-        <w:rPr>
-          <w:rFonts w:ascii="Times New Roman" w:hAnsi="Times New Roman" w:cs="Times New Roman"/>
-          <w:b/>
-          <w:bCs/>
-        </w:rPr>
-        <w:t xml:space="preserve"> </w:t>
-      </w:r>
-      <w:proofErr w:type="spellStart"/>
-      <w:r>
-        <w:rPr>
-          <w:rFonts w:ascii="Times New Roman" w:hAnsi="Times New Roman" w:cs="Times New Roman"/>
-          <w:b/>
-          <w:bCs/>
-        </w:rPr>
-        <w:t>este</w:t>
-      </w:r>
-      <w:proofErr w:type="spellEnd"/>
-      <w:r>
-        <w:rPr>
-          <w:rFonts w:ascii="Times New Roman" w:hAnsi="Times New Roman" w:cs="Times New Roman"/>
-          <w:b/>
-          <w:bCs/>
-        </w:rPr>
-        <w:t xml:space="preserve"> incident </w:t>
-      </w:r>
-      <w:proofErr w:type="spellStart"/>
-      <w:r>
-        <w:rPr>
-          <w:rFonts w:ascii="Times New Roman" w:hAnsi="Times New Roman" w:cs="Times New Roman"/>
-          <w:b/>
-          <w:bCs/>
-        </w:rPr>
-        <w:t>cazul</w:t>
-      </w:r>
-      <w:proofErr w:type="spellEnd"/>
-      <w:r>
-        <w:rPr>
-          <w:rFonts w:ascii="Times New Roman" w:hAnsi="Times New Roman" w:cs="Times New Roman"/>
-          <w:b/>
-          <w:bCs/>
-        </w:rPr>
-        <w:t xml:space="preserve"> de </w:t>
-      </w:r>
-      <w:proofErr w:type="spellStart"/>
-      <w:r>
-        <w:rPr>
-          <w:rFonts w:ascii="Times New Roman" w:hAnsi="Times New Roman" w:cs="Times New Roman"/>
-          <w:b/>
-          <w:bCs/>
-        </w:rPr>
-        <w:t>împiedicare</w:t>
-      </w:r>
-      <w:proofErr w:type="spellEnd"/>
-      <w:r>
-        <w:rPr>
-          <w:rFonts w:ascii="Times New Roman" w:hAnsi="Times New Roman" w:cs="Times New Roman"/>
-          <w:b/>
-          <w:bCs/>
-        </w:rPr>
-        <w:t xml:space="preserve"> a </w:t>
-      </w:r>
-      <w:proofErr w:type="spellStart"/>
-      <w:r>
-        <w:rPr>
-          <w:rFonts w:ascii="Times New Roman" w:hAnsi="Times New Roman" w:cs="Times New Roman"/>
-          <w:b/>
-          <w:bCs/>
-        </w:rPr>
-        <w:t>punerii</w:t>
-      </w:r>
-      <w:proofErr w:type="spellEnd"/>
-      <w:r>
-        <w:rPr>
-          <w:rFonts w:ascii="Times New Roman" w:hAnsi="Times New Roman" w:cs="Times New Roman"/>
-          <w:b/>
-          <w:bCs/>
-        </w:rPr>
-        <w:t xml:space="preserve"> </w:t>
-      </w:r>
-      <w:proofErr w:type="spellStart"/>
-      <w:r>
-        <w:rPr>
-          <w:rFonts w:ascii="Times New Roman" w:hAnsi="Times New Roman" w:cs="Times New Roman"/>
-          <w:b/>
-          <w:bCs/>
-        </w:rPr>
-        <w:t>în</w:t>
-      </w:r>
-      <w:proofErr w:type="spellEnd"/>
-      <w:r>
-        <w:rPr>
-          <w:rFonts w:ascii="Times New Roman" w:hAnsi="Times New Roman" w:cs="Times New Roman"/>
-          <w:b/>
-          <w:bCs/>
-        </w:rPr>
-        <w:t xml:space="preserve"> </w:t>
-      </w:r>
-      <w:proofErr w:type="spellStart"/>
-      <w:r>
-        <w:rPr>
-          <w:rFonts w:ascii="Times New Roman" w:hAnsi="Times New Roman" w:cs="Times New Roman"/>
-          <w:b/>
-          <w:bCs/>
-        </w:rPr>
-        <w:t>mișcare</w:t>
-      </w:r>
-      <w:proofErr w:type="spellEnd"/>
-      <w:r>
-        <w:rPr>
-          <w:rFonts w:ascii="Times New Roman" w:hAnsi="Times New Roman" w:cs="Times New Roman"/>
-          <w:b/>
-          <w:bCs/>
-        </w:rPr>
-        <w:t xml:space="preserve"> </w:t>
-      </w:r>
-      <w:proofErr w:type="gramStart"/>
-      <w:r>
-        <w:rPr>
-          <w:rFonts w:ascii="Times New Roman" w:hAnsi="Times New Roman" w:cs="Times New Roman"/>
-          <w:b/>
-          <w:bCs/>
-        </w:rPr>
-        <w:t>a</w:t>
-      </w:r>
-      <w:proofErr w:type="gramEnd"/>
-      <w:r>
-        <w:rPr>
-          <w:rFonts w:ascii="Times New Roman" w:hAnsi="Times New Roman" w:cs="Times New Roman"/>
-          <w:b/>
-          <w:bCs/>
-        </w:rPr>
-        <w:t xml:space="preserve"> </w:t>
-      </w:r>
-      <w:proofErr w:type="spellStart"/>
-      <w:r>
-        <w:rPr>
-          <w:rFonts w:ascii="Times New Roman" w:hAnsi="Times New Roman" w:cs="Times New Roman"/>
-          <w:b/>
-          <w:bCs/>
-        </w:rPr>
-        <w:t>acțiunii</w:t>
-      </w:r>
-      <w:proofErr w:type="spellEnd"/>
-      <w:r>
-        <w:rPr>
-          <w:rFonts w:ascii="Times New Roman" w:hAnsi="Times New Roman" w:cs="Times New Roman"/>
-          <w:b/>
-          <w:bCs/>
-        </w:rPr>
-        <w:t xml:space="preserve"> </w:t>
-      </w:r>
-      <w:proofErr w:type="spellStart"/>
-      <w:r>
-        <w:rPr>
-          <w:rFonts w:ascii="Times New Roman" w:hAnsi="Times New Roman" w:cs="Times New Roman"/>
-          <w:b/>
-          <w:bCs/>
-        </w:rPr>
-        <w:t>penale</w:t>
-      </w:r>
-      <w:proofErr w:type="spellEnd"/>
-      <w:r>
-        <w:rPr>
-          <w:rFonts w:ascii="Times New Roman" w:hAnsi="Times New Roman" w:cs="Times New Roman"/>
-          <w:b/>
-          <w:bCs/>
-        </w:rPr>
-        <w:t xml:space="preserve"> </w:t>
-      </w:r>
-      <w:proofErr w:type="spellStart"/>
-      <w:r>
-        <w:rPr>
-          <w:rFonts w:ascii="Times New Roman" w:hAnsi="Times New Roman" w:cs="Times New Roman"/>
-          <w:b/>
-          <w:bCs/>
-        </w:rPr>
-        <w:t>prevăzut</w:t>
-      </w:r>
-      <w:proofErr w:type="spellEnd"/>
-      <w:r>
-        <w:rPr>
-          <w:rFonts w:ascii="Times New Roman" w:hAnsi="Times New Roman" w:cs="Times New Roman"/>
-          <w:b/>
-          <w:bCs/>
-        </w:rPr>
-        <w:t xml:space="preserve"> de art. 16 </w:t>
-      </w:r>
-      <w:proofErr w:type="spellStart"/>
-      <w:r>
-        <w:rPr>
-          <w:rFonts w:ascii="Times New Roman" w:hAnsi="Times New Roman" w:cs="Times New Roman"/>
-          <w:b/>
-          <w:bCs/>
-        </w:rPr>
-        <w:t>alin</w:t>
-      </w:r>
-      <w:proofErr w:type="spellEnd"/>
-      <w:r>
-        <w:rPr>
-          <w:rFonts w:ascii="Times New Roman" w:hAnsi="Times New Roman" w:cs="Times New Roman"/>
-          <w:b/>
-          <w:bCs/>
-        </w:rPr>
-        <w:t xml:space="preserve">. 1 lit. </w:t>
-      </w:r>
-      <w:proofErr w:type="gramStart"/>
-      <w:r>
-        <w:rPr>
-          <w:rFonts w:ascii="Times New Roman" w:hAnsi="Times New Roman" w:cs="Times New Roman"/>
-          <w:b/>
-          <w:bCs/>
-        </w:rPr>
-        <w:t xml:space="preserve">{{ </w:t>
-      </w:r>
-      <w:proofErr w:type="spellStart"/>
-      <w:r>
-        <w:rPr>
-          <w:rFonts w:ascii="Times New Roman" w:hAnsi="Times New Roman" w:cs="Times New Roman"/>
-          <w:b/>
-          <w:bCs/>
-        </w:rPr>
-        <w:t>temei</w:t>
-      </w:r>
-      <w:proofErr w:type="spellEnd"/>
-      <w:proofErr w:type="gramEnd"/>
-      <w:r>
-        <w:rPr>
-          <w:rFonts w:ascii="Times New Roman" w:hAnsi="Times New Roman" w:cs="Times New Roman"/>
-          <w:b/>
-          <w:bCs/>
-        </w:rPr>
-        <w:t xml:space="preserve"> }} din </w:t>
-      </w:r>
-      <w:proofErr w:type="spellStart"/>
-      <w:r>
-        <w:rPr>
-          <w:rFonts w:ascii="Times New Roman" w:hAnsi="Times New Roman" w:cs="Times New Roman"/>
-          <w:b/>
-          <w:bCs/>
-        </w:rPr>
-        <w:t>C.proc.pen</w:t>
-      </w:r>
-      <w:proofErr w:type="spellEnd"/>
-      <w:r>
-        <w:rPr>
-          <w:rFonts w:ascii="Times New Roman" w:hAnsi="Times New Roman" w:cs="Times New Roman"/>
-          <w:b/>
-          <w:bCs/>
-        </w:rPr>
-        <w:t>.</w:t>
-      </w:r>
+        <w:spacing w:line="240" w:lineRule="auto"/>
+        <w:jc w:val="both"/>
+        <w:rPr>
+          <w:rFonts w:ascii="Times New Roman" w:hAnsi="Times New Roman" w:cs="Times New Roman"/>
+          <w:b/>
+          <w:bCs/>
+        </w:rPr>
+      </w:pPr>
     </w:p>
     <w:p>
       <w:pPr>
+        <w:spacing w:line="240" w:lineRule="auto"/>
         <w:ind w:firstLine="720"/>
-        <w:rPr>
-          <w:rFonts w:ascii="Times New Roman" w:hAnsi="Times New Roman" w:cs="Times New Roman"/>
-          <w:b/>
-          <w:bCs/>
-        </w:rPr>
-      </w:pPr>
-      <w:proofErr w:type="spellStart"/>
-      <w:r>
-        <w:rPr>
-          <w:rFonts w:ascii="Times New Roman" w:hAnsi="Times New Roman" w:cs="Times New Roman"/>
-          <w:b/>
-          <w:bCs/>
-        </w:rPr>
-        <w:t>Față</w:t>
-      </w:r>
-      <w:proofErr w:type="spellEnd"/>
-      <w:r>
-        <w:rPr>
-          <w:rFonts w:ascii="Times New Roman" w:hAnsi="Times New Roman" w:cs="Times New Roman"/>
-          <w:b/>
-          <w:bCs/>
+        <w:jc w:val="both"/>
+        <w:rPr>
+          <w:rFonts w:ascii="Times New Roman" w:hAnsi="Times New Roman" w:cs="Times New Roman"/>
+        </w:rPr>
+      </w:pPr>
+      <w:r>
+        <w:rPr>
+          <w:rFonts w:ascii="Times New Roman" w:hAnsi="Times New Roman" w:cs="Times New Roman"/>
+        </w:rPr>
+        <w:t xml:space="preserve">La data de </w:t>
+      </w:r>
+      <w:proofErr w:type="gramStart"/>
+      <w:r>
+        <w:rPr>
+          <w:rFonts w:ascii="Times New Roman" w:hAnsi="Times New Roman" w:cs="Times New Roman"/>
+        </w:rPr>
+        <w:t xml:space="preserve">{{ </w:t>
+      </w:r>
+      <w:proofErr w:type="spellStart"/>
+      <w:r>
+        <w:rPr>
+          <w:rFonts w:ascii="Times New Roman" w:hAnsi="Times New Roman" w:cs="Times New Roman"/>
+        </w:rPr>
+        <w:t>data</w:t>
+      </w:r>
+      <w:proofErr w:type="gramEnd"/>
+      <w:r>
+        <w:rPr>
+          <w:rFonts w:ascii="Times New Roman" w:hAnsi="Times New Roman" w:cs="Times New Roman"/>
+        </w:rPr>
+        <w:t>_</w:t>
+      </w:r>
+      <w:proofErr w:type="gramStart"/>
+      <w:r>
+        <w:rPr>
+          <w:rFonts w:ascii="Times New Roman" w:hAnsi="Times New Roman" w:cs="Times New Roman"/>
+        </w:rPr>
+        <w:t>inregistrarii</w:t>
+      </w:r>
+      <w:proofErr w:type="spellEnd"/>
+      <w:r>
+        <w:rPr>
+          <w:rFonts w:ascii="Times New Roman" w:hAnsi="Times New Roman" w:cs="Times New Roman"/>
+        </w:rPr>
+        <w:t xml:space="preserve"> }</w:t>
+      </w:r>
+      <w:proofErr w:type="gramEnd"/>
+      <w:r>
+        <w:rPr>
+          <w:rFonts w:ascii="Times New Roman" w:hAnsi="Times New Roman" w:cs="Times New Roman"/>
+        </w:rPr>
+        <w:t xml:space="preserve">} a </w:t>
+      </w:r>
+      <w:proofErr w:type="spellStart"/>
+      <w:r>
+        <w:rPr>
+          <w:rFonts w:ascii="Times New Roman" w:hAnsi="Times New Roman" w:cs="Times New Roman"/>
+        </w:rPr>
+        <w:t>fost</w:t>
+      </w:r>
+      <w:proofErr w:type="spellEnd"/>
+      <w:r>
+        <w:rPr>
+          <w:rFonts w:ascii="Times New Roman" w:hAnsi="Times New Roman" w:cs="Times New Roman"/>
+        </w:rPr>
+        <w:t xml:space="preserve"> </w:t>
+      </w:r>
+      <w:proofErr w:type="spellStart"/>
+      <w:r>
+        <w:rPr>
+          <w:rFonts w:ascii="Times New Roman" w:hAnsi="Times New Roman" w:cs="Times New Roman"/>
+        </w:rPr>
+        <w:t>înregistrat</w:t>
+      </w:r>
+      <w:proofErr w:type="spellEnd"/>
+      <w:r>
+        <w:rPr>
+          <w:rFonts w:ascii="Times New Roman" w:hAnsi="Times New Roman" w:cs="Times New Roman"/>
+        </w:rPr>
+        <w:t xml:space="preserve"> </w:t>
+      </w:r>
+      <w:proofErr w:type="spellStart"/>
+      <w:r>
+        <w:rPr>
+          <w:rFonts w:ascii="Times New Roman" w:hAnsi="Times New Roman" w:cs="Times New Roman"/>
+        </w:rPr>
+        <w:t>dosarul</w:t>
+      </w:r>
+      <w:proofErr w:type="spellEnd"/>
+      <w:r>
+        <w:rPr>
+          <w:rFonts w:ascii="Times New Roman" w:hAnsi="Times New Roman" w:cs="Times New Roman"/>
+        </w:rPr>
+        <w:t xml:space="preserve"> penal cu </w:t>
+      </w:r>
+      <w:proofErr w:type="spellStart"/>
+      <w:r>
+        <w:rPr>
+          <w:rFonts w:ascii="Times New Roman" w:hAnsi="Times New Roman" w:cs="Times New Roman"/>
+        </w:rPr>
+        <w:t>numărul</w:t>
+      </w:r>
+      <w:proofErr w:type="spellEnd"/>
+      <w:r>
+        <w:rPr>
+          <w:rFonts w:ascii="Times New Roman" w:hAnsi="Times New Roman" w:cs="Times New Roman"/>
         </w:rPr>
         <w:t xml:space="preserve"> de </w:t>
       </w:r>
@@ -1119,141 +667,598 @@
       <w:r>
         <w:rPr>
           <w:rFonts w:ascii="Times New Roman" w:hAnsi="Times New Roman" w:cs="Times New Roman"/>
-          <w:b/>
-          <w:bCs/>
-        </w:rPr>
-        <w:t>cele</w:t>
-      </w:r>
-      <w:proofErr w:type="spellEnd"/>
-      <w:r>
-        <w:rPr>
-          <w:rFonts w:ascii="Times New Roman" w:hAnsi="Times New Roman" w:cs="Times New Roman"/>
-          <w:b/>
-          <w:bCs/>
-        </w:rPr>
-        <w:t xml:space="preserve"> </w:t>
-      </w:r>
-      <w:proofErr w:type="spellStart"/>
-      <w:r>
-        <w:rPr>
-          <w:rFonts w:ascii="Times New Roman" w:hAnsi="Times New Roman" w:cs="Times New Roman"/>
-          <w:b/>
-          <w:bCs/>
-        </w:rPr>
-        <w:t>expuse</w:t>
-      </w:r>
-      <w:proofErr w:type="spellEnd"/>
-      <w:r>
-        <w:rPr>
-          <w:rFonts w:ascii="Times New Roman" w:hAnsi="Times New Roman" w:cs="Times New Roman"/>
-          <w:b/>
-          <w:bCs/>
-        </w:rPr>
-        <w:t xml:space="preserve">, </w:t>
-      </w:r>
-      <w:proofErr w:type="spellStart"/>
-      <w:r>
-        <w:rPr>
-          <w:rFonts w:ascii="Times New Roman" w:hAnsi="Times New Roman" w:cs="Times New Roman"/>
-          <w:b/>
-          <w:bCs/>
-        </w:rPr>
-        <w:t>În</w:t>
-      </w:r>
-      <w:proofErr w:type="spellEnd"/>
-      <w:r>
-        <w:rPr>
-          <w:rFonts w:ascii="Times New Roman" w:hAnsi="Times New Roman" w:cs="Times New Roman"/>
-          <w:b/>
-          <w:bCs/>
-        </w:rPr>
-        <w:t xml:space="preserve"> </w:t>
-      </w:r>
-      <w:proofErr w:type="spellStart"/>
-      <w:r>
-        <w:rPr>
-          <w:rFonts w:ascii="Times New Roman" w:hAnsi="Times New Roman" w:cs="Times New Roman"/>
-          <w:b/>
-          <w:bCs/>
-        </w:rPr>
-        <w:t>temeiul</w:t>
-      </w:r>
-      <w:proofErr w:type="spellEnd"/>
-      <w:r>
-        <w:rPr>
-          <w:rFonts w:ascii="Times New Roman" w:hAnsi="Times New Roman" w:cs="Times New Roman"/>
-          <w:b/>
-          <w:bCs/>
-        </w:rPr>
-        <w:t xml:space="preserve"> art. 315 </w:t>
-      </w:r>
-      <w:proofErr w:type="spellStart"/>
-      <w:r>
-        <w:rPr>
-          <w:rFonts w:ascii="Times New Roman" w:hAnsi="Times New Roman" w:cs="Times New Roman"/>
-          <w:b/>
-          <w:bCs/>
-        </w:rPr>
-        <w:t>alin</w:t>
-      </w:r>
-      <w:proofErr w:type="spellEnd"/>
-      <w:r>
-        <w:rPr>
-          <w:rFonts w:ascii="Times New Roman" w:hAnsi="Times New Roman" w:cs="Times New Roman"/>
-          <w:b/>
-          <w:bCs/>
-        </w:rPr>
-        <w:t xml:space="preserve">. 1 lit. b din </w:t>
-      </w:r>
-      <w:proofErr w:type="spellStart"/>
-      <w:r>
-        <w:rPr>
-          <w:rFonts w:ascii="Times New Roman" w:hAnsi="Times New Roman" w:cs="Times New Roman"/>
-          <w:b/>
-          <w:bCs/>
-        </w:rPr>
-        <w:t>C.proc.pen</w:t>
-      </w:r>
-      <w:proofErr w:type="spellEnd"/>
-      <w:r>
-        <w:rPr>
-          <w:rFonts w:ascii="Times New Roman" w:hAnsi="Times New Roman" w:cs="Times New Roman"/>
-          <w:b/>
-          <w:bCs/>
-        </w:rPr>
-        <w:t>.,</w:t>
+        </w:rPr>
+        <w:t>mai</w:t>
+      </w:r>
+      <w:proofErr w:type="spellEnd"/>
+      <w:r>
+        <w:rPr>
+          <w:rFonts w:ascii="Times New Roman" w:hAnsi="Times New Roman" w:cs="Times New Roman"/>
+        </w:rPr>
+        <w:t xml:space="preserve"> sus. </w:t>
       </w:r>
     </w:p>
     <w:p>
       <w:pPr>
+        <w:spacing w:line="240" w:lineRule="auto"/>
         <w:ind w:firstLine="720"/>
-        <w:rPr>
-          <w:rFonts w:ascii="Times New Roman" w:hAnsi="Times New Roman" w:cs="Times New Roman"/>
-          <w:b/>
-          <w:bCs/>
-        </w:rPr>
-      </w:pPr>
+        <w:jc w:val="both"/>
+        <w:rPr>
+          <w:rFonts w:ascii="Times New Roman" w:hAnsi="Times New Roman" w:cs="Times New Roman"/>
+        </w:rPr>
+      </w:pPr>
+      <w:r>
+        <w:rPr>
+          <w:rFonts w:ascii="Times New Roman" w:hAnsi="Times New Roman" w:cs="Times New Roman"/>
+        </w:rPr>
+        <w:t xml:space="preserve">Din </w:t>
+      </w:r>
+      <w:proofErr w:type="spellStart"/>
+      <w:r>
+        <w:rPr>
+          <w:rFonts w:ascii="Times New Roman" w:hAnsi="Times New Roman" w:cs="Times New Roman"/>
+        </w:rPr>
+        <w:t>cuprinsul</w:t>
+      </w:r>
+      <w:proofErr w:type="spellEnd"/>
+      <w:r>
+        <w:rPr>
+          <w:rFonts w:ascii="Times New Roman" w:hAnsi="Times New Roman" w:cs="Times New Roman"/>
+        </w:rPr>
+        <w:t xml:space="preserve"> </w:t>
+      </w:r>
+      <w:proofErr w:type="spellStart"/>
+      <w:r>
+        <w:rPr>
+          <w:rFonts w:ascii="Times New Roman" w:hAnsi="Times New Roman" w:cs="Times New Roman"/>
+        </w:rPr>
+        <w:t>actului</w:t>
+      </w:r>
+      <w:proofErr w:type="spellEnd"/>
+      <w:r>
+        <w:rPr>
+          <w:rFonts w:ascii="Times New Roman" w:hAnsi="Times New Roman" w:cs="Times New Roman"/>
+        </w:rPr>
+        <w:t xml:space="preserve"> de </w:t>
+      </w:r>
+      <w:proofErr w:type="spellStart"/>
+      <w:r>
+        <w:rPr>
+          <w:rFonts w:ascii="Times New Roman" w:hAnsi="Times New Roman" w:cs="Times New Roman"/>
+        </w:rPr>
+        <w:t>sesizare</w:t>
+      </w:r>
+      <w:proofErr w:type="spellEnd"/>
+      <w:r>
+        <w:rPr>
+          <w:rFonts w:ascii="Times New Roman" w:hAnsi="Times New Roman" w:cs="Times New Roman"/>
+        </w:rPr>
+        <w:t xml:space="preserve"> </w:t>
+      </w:r>
+      <w:proofErr w:type="spellStart"/>
+      <w:r>
+        <w:rPr>
+          <w:rFonts w:ascii="Times New Roman" w:hAnsi="Times New Roman" w:cs="Times New Roman"/>
+        </w:rPr>
+        <w:t>rezultă</w:t>
+      </w:r>
+      <w:proofErr w:type="spellEnd"/>
+      <w:r>
+        <w:rPr>
+          <w:rFonts w:ascii="Times New Roman" w:hAnsi="Times New Roman" w:cs="Times New Roman"/>
+        </w:rPr>
+        <w:t xml:space="preserve"> </w:t>
+      </w:r>
+      <w:proofErr w:type="spellStart"/>
+      <w:r>
+        <w:rPr>
+          <w:rFonts w:ascii="Times New Roman" w:hAnsi="Times New Roman" w:cs="Times New Roman"/>
+        </w:rPr>
+        <w:t>că</w:t>
+      </w:r>
+      <w:proofErr w:type="spellEnd"/>
+      <w:r>
+        <w:rPr>
+          <w:rFonts w:ascii="Times New Roman" w:hAnsi="Times New Roman" w:cs="Times New Roman"/>
+        </w:rPr>
+        <w:t xml:space="preserve"> </w:t>
+      </w:r>
+      <w:proofErr w:type="gramStart"/>
+      <w:r>
+        <w:rPr>
+          <w:rFonts w:ascii="Times New Roman" w:hAnsi="Times New Roman" w:cs="Times New Roman"/>
+        </w:rPr>
+        <w:t xml:space="preserve">{{ </w:t>
+      </w:r>
+      <w:proofErr w:type="spellStart"/>
+      <w:r>
+        <w:rPr>
+          <w:rFonts w:ascii="Times New Roman" w:hAnsi="Times New Roman" w:cs="Times New Roman"/>
+        </w:rPr>
+        <w:t>infractiune</w:t>
+      </w:r>
+      <w:proofErr w:type="gramEnd"/>
+      <w:r>
+        <w:rPr>
+          <w:rFonts w:ascii="Times New Roman" w:hAnsi="Times New Roman" w:cs="Times New Roman"/>
+        </w:rPr>
+        <w:t>_</w:t>
+      </w:r>
+      <w:proofErr w:type="gramStart"/>
+      <w:r>
+        <w:rPr>
+          <w:rFonts w:ascii="Times New Roman" w:hAnsi="Times New Roman" w:cs="Times New Roman"/>
+        </w:rPr>
+        <w:t>cercetata</w:t>
+      </w:r>
+      <w:proofErr w:type="spellEnd"/>
+      <w:r>
+        <w:rPr>
+          <w:rFonts w:ascii="Times New Roman" w:hAnsi="Times New Roman" w:cs="Times New Roman"/>
+        </w:rPr>
+        <w:t xml:space="preserve"> }</w:t>
+      </w:r>
+      <w:proofErr w:type="gramEnd"/>
+      <w:r>
+        <w:rPr>
+          <w:rFonts w:ascii="Times New Roman" w:hAnsi="Times New Roman" w:cs="Times New Roman"/>
+        </w:rPr>
+        <w:t xml:space="preserve">} </w:t>
+      </w:r>
     </w:p>
     <w:p>
       <w:pPr>
-        <w:jc w:val="center"/>
-        <w:rPr>
-          <w:rFonts w:ascii="Times New Roman" w:hAnsi="Times New Roman" w:cs="Times New Roman"/>
-          <w:b/>
-          <w:bCs/>
-        </w:rPr>
-      </w:pPr>
-      <w:r>
-        <w:rPr>
-          <w:rFonts w:ascii="Times New Roman" w:hAnsi="Times New Roman" w:cs="Times New Roman"/>
-          <w:b/>
-          <w:bCs/>
-        </w:rPr>
-        <w:t>DISPUN:</w:t>
+        <w:spacing w:line="240" w:lineRule="auto"/>
+        <w:ind w:firstLine="720"/>
+        <w:jc w:val="both"/>
+        <w:rPr>
+          <w:rFonts w:ascii="Times New Roman" w:hAnsi="Times New Roman" w:cs="Times New Roman"/>
+        </w:rPr>
+      </w:pPr>
+      <w:r>
+        <w:rPr>
+          <w:rFonts w:ascii="Times New Roman" w:hAnsi="Times New Roman" w:cs="Times New Roman"/>
+        </w:rPr>
+        <w:t xml:space="preserve">Din </w:t>
+      </w:r>
+      <w:proofErr w:type="spellStart"/>
+      <w:r>
+        <w:rPr>
+          <w:rFonts w:ascii="Times New Roman" w:hAnsi="Times New Roman" w:cs="Times New Roman"/>
+        </w:rPr>
+        <w:t>actele</w:t>
+      </w:r>
+      <w:proofErr w:type="spellEnd"/>
+      <w:r>
+        <w:rPr>
+          <w:rFonts w:ascii="Times New Roman" w:hAnsi="Times New Roman" w:cs="Times New Roman"/>
+        </w:rPr>
+        <w:t xml:space="preserve"> de </w:t>
+      </w:r>
+      <w:proofErr w:type="spellStart"/>
+      <w:r>
+        <w:rPr>
+          <w:rFonts w:ascii="Times New Roman" w:hAnsi="Times New Roman" w:cs="Times New Roman"/>
+        </w:rPr>
+        <w:t>urmărire</w:t>
+      </w:r>
+      <w:proofErr w:type="spellEnd"/>
+      <w:r>
+        <w:rPr>
+          <w:rFonts w:ascii="Times New Roman" w:hAnsi="Times New Roman" w:cs="Times New Roman"/>
+        </w:rPr>
+        <w:t xml:space="preserve"> </w:t>
+      </w:r>
+      <w:proofErr w:type="spellStart"/>
+      <w:r>
+        <w:rPr>
+          <w:rFonts w:ascii="Times New Roman" w:hAnsi="Times New Roman" w:cs="Times New Roman"/>
+        </w:rPr>
+        <w:t>efectuate</w:t>
+      </w:r>
+      <w:proofErr w:type="spellEnd"/>
+      <w:r>
+        <w:rPr>
+          <w:rFonts w:ascii="Times New Roman" w:hAnsi="Times New Roman" w:cs="Times New Roman"/>
+        </w:rPr>
+        <w:t xml:space="preserve"> </w:t>
+      </w:r>
+      <w:proofErr w:type="spellStart"/>
+      <w:r>
+        <w:rPr>
+          <w:rFonts w:ascii="Times New Roman" w:hAnsi="Times New Roman" w:cs="Times New Roman"/>
+        </w:rPr>
+        <w:t>în</w:t>
+      </w:r>
+      <w:proofErr w:type="spellEnd"/>
+      <w:r>
+        <w:rPr>
+          <w:rFonts w:ascii="Times New Roman" w:hAnsi="Times New Roman" w:cs="Times New Roman"/>
+        </w:rPr>
+        <w:t xml:space="preserve"> </w:t>
+      </w:r>
+      <w:proofErr w:type="spellStart"/>
+      <w:r>
+        <w:rPr>
+          <w:rFonts w:ascii="Times New Roman" w:hAnsi="Times New Roman" w:cs="Times New Roman"/>
+        </w:rPr>
+        <w:t>cauză</w:t>
+      </w:r>
+      <w:proofErr w:type="spellEnd"/>
+      <w:r>
+        <w:rPr>
+          <w:rFonts w:ascii="Times New Roman" w:hAnsi="Times New Roman" w:cs="Times New Roman"/>
+        </w:rPr>
+        <w:t xml:space="preserve"> </w:t>
+      </w:r>
+      <w:proofErr w:type="spellStart"/>
+      <w:r>
+        <w:rPr>
+          <w:rFonts w:ascii="Times New Roman" w:hAnsi="Times New Roman" w:cs="Times New Roman"/>
+        </w:rPr>
+        <w:t>rezultă</w:t>
+      </w:r>
+      <w:proofErr w:type="spellEnd"/>
+      <w:r>
+        <w:rPr>
+          <w:rFonts w:ascii="Times New Roman" w:hAnsi="Times New Roman" w:cs="Times New Roman"/>
+        </w:rPr>
+        <w:t xml:space="preserve"> </w:t>
+      </w:r>
+      <w:proofErr w:type="spellStart"/>
+      <w:r>
+        <w:rPr>
+          <w:rFonts w:ascii="Times New Roman" w:hAnsi="Times New Roman" w:cs="Times New Roman"/>
+        </w:rPr>
+        <w:t>că</w:t>
+      </w:r>
+      <w:proofErr w:type="spellEnd"/>
+      <w:r>
+        <w:rPr>
+          <w:rFonts w:ascii="Times New Roman" w:hAnsi="Times New Roman" w:cs="Times New Roman"/>
+        </w:rPr>
+        <w:t xml:space="preserve"> </w:t>
+      </w:r>
+      <w:proofErr w:type="spellStart"/>
+      <w:r>
+        <w:rPr>
+          <w:rFonts w:ascii="Times New Roman" w:hAnsi="Times New Roman" w:cs="Times New Roman"/>
+        </w:rPr>
+        <w:t>este</w:t>
+      </w:r>
+      <w:proofErr w:type="spellEnd"/>
+      <w:r>
+        <w:rPr>
+          <w:rFonts w:ascii="Times New Roman" w:hAnsi="Times New Roman" w:cs="Times New Roman"/>
+        </w:rPr>
+        <w:t xml:space="preserve"> incident </w:t>
+      </w:r>
+      <w:proofErr w:type="spellStart"/>
+      <w:r>
+        <w:rPr>
+          <w:rFonts w:ascii="Times New Roman" w:hAnsi="Times New Roman" w:cs="Times New Roman"/>
+        </w:rPr>
+        <w:t>cazul</w:t>
+      </w:r>
+      <w:proofErr w:type="spellEnd"/>
+      <w:r>
+        <w:rPr>
+          <w:rFonts w:ascii="Times New Roman" w:hAnsi="Times New Roman" w:cs="Times New Roman"/>
+        </w:rPr>
+        <w:t xml:space="preserve"> de </w:t>
+      </w:r>
+      <w:proofErr w:type="spellStart"/>
+      <w:r>
+        <w:rPr>
+          <w:rFonts w:ascii="Times New Roman" w:hAnsi="Times New Roman" w:cs="Times New Roman"/>
+        </w:rPr>
+        <w:t>împiedicare</w:t>
+      </w:r>
+      <w:proofErr w:type="spellEnd"/>
+      <w:r>
+        <w:rPr>
+          <w:rFonts w:ascii="Times New Roman" w:hAnsi="Times New Roman" w:cs="Times New Roman"/>
+        </w:rPr>
+        <w:t xml:space="preserve"> a </w:t>
+      </w:r>
+      <w:proofErr w:type="spellStart"/>
+      <w:r>
+        <w:rPr>
+          <w:rFonts w:ascii="Times New Roman" w:hAnsi="Times New Roman" w:cs="Times New Roman"/>
+        </w:rPr>
+        <w:t>punerii</w:t>
+      </w:r>
+      <w:proofErr w:type="spellEnd"/>
+      <w:r>
+        <w:rPr>
+          <w:rFonts w:ascii="Times New Roman" w:hAnsi="Times New Roman" w:cs="Times New Roman"/>
+        </w:rPr>
+        <w:t xml:space="preserve"> </w:t>
+      </w:r>
+      <w:proofErr w:type="spellStart"/>
+      <w:r>
+        <w:rPr>
+          <w:rFonts w:ascii="Times New Roman" w:hAnsi="Times New Roman" w:cs="Times New Roman"/>
+        </w:rPr>
+        <w:t>în</w:t>
+      </w:r>
+      <w:proofErr w:type="spellEnd"/>
+      <w:r>
+        <w:rPr>
+          <w:rFonts w:ascii="Times New Roman" w:hAnsi="Times New Roman" w:cs="Times New Roman"/>
+        </w:rPr>
+        <w:t xml:space="preserve"> </w:t>
+      </w:r>
+      <w:proofErr w:type="spellStart"/>
+      <w:r>
+        <w:rPr>
+          <w:rFonts w:ascii="Times New Roman" w:hAnsi="Times New Roman" w:cs="Times New Roman"/>
+        </w:rPr>
+        <w:t>mișcare</w:t>
+      </w:r>
+      <w:proofErr w:type="spellEnd"/>
+      <w:r>
+        <w:rPr>
+          <w:rFonts w:ascii="Times New Roman" w:hAnsi="Times New Roman" w:cs="Times New Roman"/>
+        </w:rPr>
+        <w:t xml:space="preserve"> </w:t>
+      </w:r>
+      <w:proofErr w:type="gramStart"/>
+      <w:r>
+        <w:rPr>
+          <w:rFonts w:ascii="Times New Roman" w:hAnsi="Times New Roman" w:cs="Times New Roman"/>
+        </w:rPr>
+        <w:t>a</w:t>
+      </w:r>
+      <w:proofErr w:type="gramEnd"/>
+      <w:r>
+        <w:rPr>
+          <w:rFonts w:ascii="Times New Roman" w:hAnsi="Times New Roman" w:cs="Times New Roman"/>
+        </w:rPr>
+        <w:t xml:space="preserve"> </w:t>
+      </w:r>
+      <w:proofErr w:type="spellStart"/>
+      <w:r>
+        <w:rPr>
+          <w:rFonts w:ascii="Times New Roman" w:hAnsi="Times New Roman" w:cs="Times New Roman"/>
+        </w:rPr>
+        <w:t>acțiunii</w:t>
+      </w:r>
+      <w:proofErr w:type="spellEnd"/>
+      <w:r>
+        <w:rPr>
+          <w:rFonts w:ascii="Times New Roman" w:hAnsi="Times New Roman" w:cs="Times New Roman"/>
+        </w:rPr>
+        <w:t xml:space="preserve"> </w:t>
+      </w:r>
+      <w:proofErr w:type="spellStart"/>
+      <w:r>
+        <w:rPr>
+          <w:rFonts w:ascii="Times New Roman" w:hAnsi="Times New Roman" w:cs="Times New Roman"/>
+        </w:rPr>
+        <w:t>penale</w:t>
+      </w:r>
+      <w:proofErr w:type="spellEnd"/>
+      <w:r>
+        <w:rPr>
+          <w:rFonts w:ascii="Times New Roman" w:hAnsi="Times New Roman" w:cs="Times New Roman"/>
+        </w:rPr>
+        <w:t xml:space="preserve"> </w:t>
+      </w:r>
+      <w:proofErr w:type="spellStart"/>
+      <w:r>
+        <w:rPr>
+          <w:rFonts w:ascii="Times New Roman" w:hAnsi="Times New Roman" w:cs="Times New Roman"/>
+        </w:rPr>
+        <w:t>prevăzut</w:t>
+      </w:r>
+      <w:proofErr w:type="spellEnd"/>
+      <w:r>
+        <w:rPr>
+          <w:rFonts w:ascii="Times New Roman" w:hAnsi="Times New Roman" w:cs="Times New Roman"/>
+        </w:rPr>
+        <w:t xml:space="preserve"> de art. 16 </w:t>
+      </w:r>
+      <w:proofErr w:type="spellStart"/>
+      <w:r>
+        <w:rPr>
+          <w:rFonts w:ascii="Times New Roman" w:hAnsi="Times New Roman" w:cs="Times New Roman"/>
+        </w:rPr>
+        <w:t>alin</w:t>
+      </w:r>
+      <w:proofErr w:type="spellEnd"/>
+      <w:r>
+        <w:rPr>
+          <w:rFonts w:ascii="Times New Roman" w:hAnsi="Times New Roman" w:cs="Times New Roman"/>
+        </w:rPr>
+        <w:t xml:space="preserve">. 1 lit. </w:t>
+      </w:r>
+      <w:proofErr w:type="gramStart"/>
+      <w:r>
+        <w:rPr>
+          <w:rFonts w:ascii="Times New Roman" w:hAnsi="Times New Roman" w:cs="Times New Roman"/>
+        </w:rPr>
+        <w:t xml:space="preserve">{{ </w:t>
+      </w:r>
+      <w:proofErr w:type="spellStart"/>
+      <w:r>
+        <w:rPr>
+          <w:rFonts w:ascii="Times New Roman" w:hAnsi="Times New Roman" w:cs="Times New Roman"/>
+        </w:rPr>
+        <w:t>temei</w:t>
+      </w:r>
+      <w:proofErr w:type="spellEnd"/>
+      <w:proofErr w:type="gramEnd"/>
+      <w:r>
+        <w:rPr>
+          <w:rFonts w:ascii="Times New Roman" w:hAnsi="Times New Roman" w:cs="Times New Roman"/>
+        </w:rPr>
+        <w:t xml:space="preserve"> }} din </w:t>
+      </w:r>
+      <w:proofErr w:type="spellStart"/>
+      <w:r>
+        <w:rPr>
+          <w:rFonts w:ascii="Times New Roman" w:hAnsi="Times New Roman" w:cs="Times New Roman"/>
+        </w:rPr>
+        <w:t>C.proc.pen</w:t>
+      </w:r>
+      <w:proofErr w:type="spellEnd"/>
+      <w:r>
+        <w:rPr>
+          <w:rFonts w:ascii="Times New Roman" w:hAnsi="Times New Roman" w:cs="Times New Roman"/>
+        </w:rPr>
+        <w:t>.</w:t>
       </w:r>
     </w:p>
     <w:p>
       <w:pPr>
+        <w:spacing w:line="240" w:lineRule="auto"/>
+        <w:ind w:firstLine="720"/>
+        <w:jc w:val="both"/>
+        <w:rPr>
+          <w:rFonts w:ascii="Times New Roman" w:hAnsi="Times New Roman" w:cs="Times New Roman"/>
+        </w:rPr>
+      </w:pPr>
+      <w:proofErr w:type="spellStart"/>
+      <w:r>
+        <w:rPr>
+          <w:rFonts w:ascii="Times New Roman" w:hAnsi="Times New Roman" w:cs="Times New Roman"/>
+        </w:rPr>
+        <w:t>Față</w:t>
+      </w:r>
+      <w:proofErr w:type="spellEnd"/>
+      <w:r>
+        <w:rPr>
+          <w:rFonts w:ascii="Times New Roman" w:hAnsi="Times New Roman" w:cs="Times New Roman"/>
+        </w:rPr>
+        <w:t xml:space="preserve"> de </w:t>
+      </w:r>
+      <w:proofErr w:type="spellStart"/>
+      <w:r>
+        <w:rPr>
+          <w:rFonts w:ascii="Times New Roman" w:hAnsi="Times New Roman" w:cs="Times New Roman"/>
+        </w:rPr>
+        <w:t>cele</w:t>
+      </w:r>
+      <w:proofErr w:type="spellEnd"/>
+      <w:r>
+        <w:rPr>
+          <w:rFonts w:ascii="Times New Roman" w:hAnsi="Times New Roman" w:cs="Times New Roman"/>
+        </w:rPr>
+        <w:t xml:space="preserve"> </w:t>
+      </w:r>
+      <w:proofErr w:type="spellStart"/>
+      <w:r>
+        <w:rPr>
+          <w:rFonts w:ascii="Times New Roman" w:hAnsi="Times New Roman" w:cs="Times New Roman"/>
+        </w:rPr>
+        <w:t>expuse</w:t>
+      </w:r>
+      <w:proofErr w:type="spellEnd"/>
+      <w:r>
+        <w:rPr>
+          <w:rFonts w:ascii="Times New Roman" w:hAnsi="Times New Roman" w:cs="Times New Roman"/>
+        </w:rPr>
+        <w:t xml:space="preserve">, </w:t>
+      </w:r>
+      <w:proofErr w:type="spellStart"/>
+      <w:r>
+        <w:rPr>
+          <w:rFonts w:ascii="Times New Roman" w:hAnsi="Times New Roman" w:cs="Times New Roman"/>
+        </w:rPr>
+        <w:t>î</w:t>
+      </w:r>
+      <w:r>
+        <w:rPr>
+          <w:rFonts w:ascii="Times New Roman" w:hAnsi="Times New Roman" w:cs="Times New Roman"/>
+        </w:rPr>
+        <w:t>n</w:t>
+      </w:r>
+      <w:proofErr w:type="spellEnd"/>
+      <w:r>
+        <w:rPr>
+          <w:rFonts w:ascii="Times New Roman" w:hAnsi="Times New Roman" w:cs="Times New Roman"/>
+        </w:rPr>
+        <w:t xml:space="preserve"> </w:t>
+      </w:r>
+      <w:proofErr w:type="spellStart"/>
+      <w:r>
+        <w:rPr>
+          <w:rFonts w:ascii="Times New Roman" w:hAnsi="Times New Roman" w:cs="Times New Roman"/>
+        </w:rPr>
+        <w:t>temeiul</w:t>
+      </w:r>
+      <w:proofErr w:type="spellEnd"/>
+      <w:r>
+        <w:rPr>
+          <w:rFonts w:ascii="Times New Roman" w:hAnsi="Times New Roman" w:cs="Times New Roman"/>
+        </w:rPr>
+        <w:t xml:space="preserve"> art. 315 </w:t>
+      </w:r>
+      <w:proofErr w:type="spellStart"/>
+      <w:r>
+        <w:rPr>
+          <w:rFonts w:ascii="Times New Roman" w:hAnsi="Times New Roman" w:cs="Times New Roman"/>
+        </w:rPr>
+        <w:t>alin</w:t>
+      </w:r>
+      <w:proofErr w:type="spellEnd"/>
+      <w:r>
+        <w:rPr>
+          <w:rFonts w:ascii="Times New Roman" w:hAnsi="Times New Roman" w:cs="Times New Roman"/>
+        </w:rPr>
+        <w:t xml:space="preserve">. 1 lit. b din </w:t>
+      </w:r>
+      <w:proofErr w:type="spellStart"/>
+      <w:r>
+        <w:rPr>
+          <w:rFonts w:ascii="Times New Roman" w:hAnsi="Times New Roman" w:cs="Times New Roman"/>
+        </w:rPr>
+        <w:t>C.proc.pen</w:t>
+      </w:r>
+      <w:proofErr w:type="spellEnd"/>
+      <w:r>
+        <w:rPr>
+          <w:rFonts w:ascii="Times New Roman" w:hAnsi="Times New Roman" w:cs="Times New Roman"/>
+        </w:rPr>
+        <w:t>.,</w:t>
+      </w:r>
+    </w:p>
+    <w:p>
+      <w:pPr>
+        <w:spacing w:line="240" w:lineRule="auto"/>
+        <w:ind w:firstLine="720"/>
+        <w:jc w:val="both"/>
+        <w:rPr>
+          <w:rFonts w:ascii="Times New Roman" w:hAnsi="Times New Roman" w:cs="Times New Roman"/>
+          <w:b/>
+          <w:bCs/>
+        </w:rPr>
+      </w:pPr>
+    </w:p>
+    <w:p>
+      <w:pPr>
+        <w:spacing w:line="240" w:lineRule="auto"/>
+        <w:jc w:val="center"/>
+        <w:rPr>
+          <w:rFonts w:ascii="Times New Roman" w:hAnsi="Times New Roman" w:cs="Times New Roman"/>
+          <w:b/>
+          <w:bCs/>
+        </w:rPr>
+      </w:pPr>
+      <w:r>
+        <w:rPr>
+          <w:rFonts w:ascii="Times New Roman" w:hAnsi="Times New Roman" w:cs="Times New Roman"/>
+          <w:b/>
+          <w:bCs/>
+        </w:rPr>
+        <w:t>DISPUN:</w:t>
+      </w:r>
+    </w:p>
+    <w:p>
+      <w:pPr>
+        <w:spacing w:line="240" w:lineRule="auto"/>
+        <w:jc w:val="both"/>
         <w:rPr>
           <w:rFonts w:ascii="Times New Roman" w:hAnsi="Times New Roman" w:cs="Times New Roman"/>
           <w:b/>
@@ -1267,18 +1272,16 @@
           <w:ilvl w:val="0"/>
           <w:numId w:val="3"/>
         </w:numPr>
-        <w:rPr>
-          <w:rFonts w:ascii="Times New Roman" w:hAnsi="Times New Roman" w:cs="Times New Roman"/>
-          <w:b/>
-          <w:bCs/>
-        </w:rPr>
-      </w:pPr>
-      <w:proofErr w:type="spellStart"/>
-      <w:r>
-        <w:rPr>
-          <w:rFonts w:ascii="Times New Roman" w:hAnsi="Times New Roman" w:cs="Times New Roman"/>
-          <w:b/>
-          <w:bCs/>
+        <w:spacing w:line="240" w:lineRule="auto"/>
+        <w:jc w:val="both"/>
+        <w:rPr>
+          <w:rFonts w:ascii="Times New Roman" w:hAnsi="Times New Roman" w:cs="Times New Roman"/>
+        </w:rPr>
+      </w:pPr>
+      <w:proofErr w:type="spellStart"/>
+      <w:r>
+        <w:rPr>
+          <w:rFonts w:ascii="Times New Roman" w:hAnsi="Times New Roman" w:cs="Times New Roman"/>
         </w:rPr>
         <w:t>Clasarea</w:t>
       </w:r>
@@ -1286,8 +1289,6 @@
       <w:r>
         <w:rPr>
           <w:rFonts w:ascii="Times New Roman" w:hAnsi="Times New Roman" w:cs="Times New Roman"/>
-          <w:b/>
-          <w:bCs/>
         </w:rPr>
         <w:t xml:space="preserve"> </w:t>
       </w:r>
@@ -1295,8 +1296,6 @@
       <w:r>
         <w:rPr>
           <w:rFonts w:ascii="Times New Roman" w:hAnsi="Times New Roman" w:cs="Times New Roman"/>
-          <w:b/>
-          <w:bCs/>
         </w:rPr>
         <w:t>cauzei</w:t>
       </w:r>
@@ -1304,8 +1303,6 @@
       <w:r>
         <w:rPr>
           <w:rFonts w:ascii="Times New Roman" w:hAnsi="Times New Roman" w:cs="Times New Roman"/>
-          <w:b/>
-          <w:bCs/>
         </w:rPr>
         <w:t xml:space="preserve"> </w:t>
       </w:r>
@@ -1313,8 +1310,6 @@
       <w:r>
         <w:rPr>
           <w:rFonts w:ascii="Times New Roman" w:hAnsi="Times New Roman" w:cs="Times New Roman"/>
-          <w:b/>
-          <w:bCs/>
         </w:rPr>
         <w:t>având</w:t>
       </w:r>
@@ -1322,8 +1317,6 @@
       <w:r>
         <w:rPr>
           <w:rFonts w:ascii="Times New Roman" w:hAnsi="Times New Roman" w:cs="Times New Roman"/>
-          <w:b/>
-          <w:bCs/>
         </w:rPr>
         <w:t xml:space="preserve"> ca </w:t>
       </w:r>
@@ -1331,8 +1324,6 @@
       <w:r>
         <w:rPr>
           <w:rFonts w:ascii="Times New Roman" w:hAnsi="Times New Roman" w:cs="Times New Roman"/>
-          <w:b/>
-          <w:bCs/>
         </w:rPr>
         <w:t>obiect</w:t>
       </w:r>
@@ -1340,8 +1331,6 @@
       <w:r>
         <w:rPr>
           <w:rFonts w:ascii="Times New Roman" w:hAnsi="Times New Roman" w:cs="Times New Roman"/>
-          <w:b/>
-          <w:bCs/>
         </w:rPr>
         <w:t xml:space="preserve"> </w:t>
       </w:r>
@@ -1349,8 +1338,6 @@
       <w:r>
         <w:rPr>
           <w:rFonts w:ascii="Times New Roman" w:hAnsi="Times New Roman" w:cs="Times New Roman"/>
-          <w:b/>
-          <w:bCs/>
         </w:rPr>
         <w:t>săvârșirea</w:t>
       </w:r>
@@ -1358,8 +1345,6 @@
       <w:r>
         <w:rPr>
           <w:rFonts w:ascii="Times New Roman" w:hAnsi="Times New Roman" w:cs="Times New Roman"/>
-          <w:b/>
-          <w:bCs/>
         </w:rPr>
         <w:t xml:space="preserve"> </w:t>
       </w:r>
@@ -1367,8 +1352,6 @@
       <w:r>
         <w:rPr>
           <w:rFonts w:ascii="Times New Roman" w:hAnsi="Times New Roman" w:cs="Times New Roman"/>
-          <w:b/>
-          <w:bCs/>
         </w:rPr>
         <w:t>infracțiunii</w:t>
       </w:r>
@@ -1376,8 +1359,6 @@
       <w:r>
         <w:rPr>
           <w:rFonts w:ascii="Times New Roman" w:hAnsi="Times New Roman" w:cs="Times New Roman"/>
-          <w:b/>
-          <w:bCs/>
         </w:rPr>
         <w:t xml:space="preserve"> de </w:t>
       </w:r>
@@ -1385,8 +1366,6 @@
       <w:r>
         <w:rPr>
           <w:rFonts w:ascii="Times New Roman" w:hAnsi="Times New Roman" w:cs="Times New Roman"/>
-          <w:b/>
-          <w:bCs/>
         </w:rPr>
         <w:t xml:space="preserve">{{ </w:t>
       </w:r>
@@ -1394,8 +1373,6 @@
       <w:r>
         <w:rPr>
           <w:rFonts w:ascii="Times New Roman" w:hAnsi="Times New Roman" w:cs="Times New Roman"/>
-          <w:b/>
-          <w:bCs/>
         </w:rPr>
         <w:t>incadrare</w:t>
       </w:r>
@@ -1403,8 +1380,6 @@
       <w:r>
         <w:rPr>
           <w:rFonts w:ascii="Times New Roman" w:hAnsi="Times New Roman" w:cs="Times New Roman"/>
-          <w:b/>
-          <w:bCs/>
         </w:rPr>
         <w:t>_</w:t>
       </w:r>
@@ -1412,8 +1387,6 @@
       <w:r>
         <w:rPr>
           <w:rFonts w:ascii="Times New Roman" w:hAnsi="Times New Roman" w:cs="Times New Roman"/>
-          <w:b/>
-          <w:bCs/>
         </w:rPr>
         <w:t>juridica</w:t>
       </w:r>
@@ -1421,8 +1394,6 @@
       <w:r>
         <w:rPr>
           <w:rFonts w:ascii="Times New Roman" w:hAnsi="Times New Roman" w:cs="Times New Roman"/>
-          <w:b/>
-          <w:bCs/>
         </w:rPr>
         <w:t xml:space="preserve"> }</w:t>
       </w:r>
@@ -1430,8 +1401,6 @@
       <w:r>
         <w:rPr>
           <w:rFonts w:ascii="Times New Roman" w:hAnsi="Times New Roman" w:cs="Times New Roman"/>
-          <w:b/>
-          <w:bCs/>
         </w:rPr>
         <w:t xml:space="preserve">}, </w:t>
       </w:r>
@@ -1439,8 +1408,6 @@
       <w:r>
         <w:rPr>
           <w:rFonts w:ascii="Times New Roman" w:hAnsi="Times New Roman" w:cs="Times New Roman"/>
-          <w:b/>
-          <w:bCs/>
         </w:rPr>
         <w:t>prevăzută</w:t>
       </w:r>
@@ -1448,8 +1415,6 @@
       <w:r>
         <w:rPr>
           <w:rFonts w:ascii="Times New Roman" w:hAnsi="Times New Roman" w:cs="Times New Roman"/>
-          <w:b/>
-          <w:bCs/>
         </w:rPr>
         <w:t xml:space="preserve"> de art. </w:t>
       </w:r>
@@ -1457,8 +1422,6 @@
       <w:r>
         <w:rPr>
           <w:rFonts w:ascii="Times New Roman" w:hAnsi="Times New Roman" w:cs="Times New Roman"/>
-          <w:b/>
-          <w:bCs/>
         </w:rPr>
         <w:t xml:space="preserve">{{ </w:t>
       </w:r>
@@ -1466,8 +1429,6 @@
       <w:r>
         <w:rPr>
           <w:rFonts w:ascii="Times New Roman" w:hAnsi="Times New Roman" w:cs="Times New Roman"/>
-          <w:b/>
-          <w:bCs/>
         </w:rPr>
         <w:t>articol</w:t>
       </w:r>
@@ -1476,8 +1437,6 @@
       <w:r>
         <w:rPr>
           <w:rFonts w:ascii="Times New Roman" w:hAnsi="Times New Roman" w:cs="Times New Roman"/>
-          <w:b/>
-          <w:bCs/>
         </w:rPr>
         <w:t xml:space="preserve"> }} din </w:t>
       </w:r>
@@ -1485,8 +1444,6 @@
       <w:r>
         <w:rPr>
           <w:rFonts w:ascii="Times New Roman" w:hAnsi="Times New Roman" w:cs="Times New Roman"/>
-          <w:b/>
-          <w:bCs/>
         </w:rPr>
         <w:t xml:space="preserve">{{ </w:t>
       </w:r>
@@ -1494,8 +1451,6 @@
       <w:r>
         <w:rPr>
           <w:rFonts w:ascii="Times New Roman" w:hAnsi="Times New Roman" w:cs="Times New Roman"/>
-          <w:b/>
-          <w:bCs/>
         </w:rPr>
         <w:t>act</w:t>
       </w:r>
@@ -1503,8 +1458,6 @@
       <w:r>
         <w:rPr>
           <w:rFonts w:ascii="Times New Roman" w:hAnsi="Times New Roman" w:cs="Times New Roman"/>
-          <w:b/>
-          <w:bCs/>
         </w:rPr>
         <w:t>_</w:t>
       </w:r>
@@ -1512,8 +1465,6 @@
       <w:r>
         <w:rPr>
           <w:rFonts w:ascii="Times New Roman" w:hAnsi="Times New Roman" w:cs="Times New Roman"/>
-          <w:b/>
-          <w:bCs/>
         </w:rPr>
         <w:t>normativ</w:t>
       </w:r>
@@ -1521,8 +1472,6 @@
       <w:r>
         <w:rPr>
           <w:rFonts w:ascii="Times New Roman" w:hAnsi="Times New Roman" w:cs="Times New Roman"/>
-          <w:b/>
-          <w:bCs/>
         </w:rPr>
         <w:t xml:space="preserve"> }</w:t>
       </w:r>
@@ -1530,8 +1479,6 @@
       <w:r>
         <w:rPr>
           <w:rFonts w:ascii="Times New Roman" w:hAnsi="Times New Roman" w:cs="Times New Roman"/>
-          <w:b/>
-          <w:bCs/>
         </w:rPr>
         <w:t>}.</w:t>
       </w:r>
@@ -1542,18 +1489,16 @@
           <w:ilvl w:val="0"/>
           <w:numId w:val="3"/>
         </w:numPr>
-        <w:rPr>
-          <w:rFonts w:ascii="Times New Roman" w:hAnsi="Times New Roman" w:cs="Times New Roman"/>
-          <w:b/>
-          <w:bCs/>
-        </w:rPr>
-      </w:pPr>
-      <w:proofErr w:type="spellStart"/>
-      <w:r>
-        <w:rPr>
-          <w:rFonts w:ascii="Times New Roman" w:hAnsi="Times New Roman" w:cs="Times New Roman"/>
-          <w:b/>
-          <w:bCs/>
+        <w:spacing w:line="240" w:lineRule="auto"/>
+        <w:jc w:val="both"/>
+        <w:rPr>
+          <w:rFonts w:ascii="Times New Roman" w:hAnsi="Times New Roman" w:cs="Times New Roman"/>
+        </w:rPr>
+      </w:pPr>
+      <w:proofErr w:type="spellStart"/>
+      <w:r>
+        <w:rPr>
+          <w:rFonts w:ascii="Times New Roman" w:hAnsi="Times New Roman" w:cs="Times New Roman"/>
         </w:rPr>
         <w:t>Cheltuielile</w:t>
       </w:r>
@@ -1561,8 +1506,6 @@
       <w:r>
         <w:rPr>
           <w:rFonts w:ascii="Times New Roman" w:hAnsi="Times New Roman" w:cs="Times New Roman"/>
-          <w:b/>
-          <w:bCs/>
         </w:rPr>
         <w:t xml:space="preserve"> </w:t>
       </w:r>
@@ -1570,8 +1513,6 @@
       <w:r>
         <w:rPr>
           <w:rFonts w:ascii="Times New Roman" w:hAnsi="Times New Roman" w:cs="Times New Roman"/>
-          <w:b/>
-          <w:bCs/>
         </w:rPr>
         <w:t>judiciare</w:t>
       </w:r>
@@ -1579,8 +1520,6 @@
       <w:r>
         <w:rPr>
           <w:rFonts w:ascii="Times New Roman" w:hAnsi="Times New Roman" w:cs="Times New Roman"/>
-          <w:b/>
-          <w:bCs/>
         </w:rPr>
         <w:t xml:space="preserve"> </w:t>
       </w:r>
@@ -1588,8 +1527,6 @@
       <w:r>
         <w:rPr>
           <w:rFonts w:ascii="Times New Roman" w:hAnsi="Times New Roman" w:cs="Times New Roman"/>
-          <w:b/>
-          <w:bCs/>
         </w:rPr>
         <w:t>rămân</w:t>
       </w:r>
@@ -1597,8 +1534,6 @@
       <w:r>
         <w:rPr>
           <w:rFonts w:ascii="Times New Roman" w:hAnsi="Times New Roman" w:cs="Times New Roman"/>
-          <w:b/>
-          <w:bCs/>
         </w:rPr>
         <w:t xml:space="preserve"> </w:t>
       </w:r>
@@ -1606,8 +1541,6 @@
       <w:r>
         <w:rPr>
           <w:rFonts w:ascii="Times New Roman" w:hAnsi="Times New Roman" w:cs="Times New Roman"/>
-          <w:b/>
-          <w:bCs/>
         </w:rPr>
         <w:t>în</w:t>
       </w:r>
@@ -1615,8 +1548,6 @@
       <w:r>
         <w:rPr>
           <w:rFonts w:ascii="Times New Roman" w:hAnsi="Times New Roman" w:cs="Times New Roman"/>
-          <w:b/>
-          <w:bCs/>
         </w:rPr>
         <w:t xml:space="preserve"> sarcina </w:t>
       </w:r>
@@ -1624,8 +1555,6 @@
       <w:r>
         <w:rPr>
           <w:rFonts w:ascii="Times New Roman" w:hAnsi="Times New Roman" w:cs="Times New Roman"/>
-          <w:b/>
-          <w:bCs/>
         </w:rPr>
         <w:t>statului</w:t>
       </w:r>
@@ -1633,8 +1562,6 @@
       <w:r>
         <w:rPr>
           <w:rFonts w:ascii="Times New Roman" w:hAnsi="Times New Roman" w:cs="Times New Roman"/>
-          <w:b/>
-          <w:bCs/>
         </w:rPr>
         <w:t>.</w:t>
       </w:r>
@@ -1645,18 +1572,16 @@
           <w:ilvl w:val="0"/>
           <w:numId w:val="3"/>
         </w:numPr>
-        <w:rPr>
-          <w:rFonts w:ascii="Times New Roman" w:hAnsi="Times New Roman" w:cs="Times New Roman"/>
-          <w:b/>
-          <w:bCs/>
-        </w:rPr>
-      </w:pPr>
-      <w:proofErr w:type="spellStart"/>
-      <w:r>
-        <w:rPr>
-          <w:rFonts w:ascii="Times New Roman" w:hAnsi="Times New Roman" w:cs="Times New Roman"/>
-          <w:b/>
-          <w:bCs/>
+        <w:spacing w:line="240" w:lineRule="auto"/>
+        <w:jc w:val="both"/>
+        <w:rPr>
+          <w:rFonts w:ascii="Times New Roman" w:hAnsi="Times New Roman" w:cs="Times New Roman"/>
+        </w:rPr>
+      </w:pPr>
+      <w:proofErr w:type="spellStart"/>
+      <w:r>
+        <w:rPr>
+          <w:rFonts w:ascii="Times New Roman" w:hAnsi="Times New Roman" w:cs="Times New Roman"/>
         </w:rPr>
         <w:t>Ordonanța</w:t>
       </w:r>
@@ -1664,8 +1589,6 @@
       <w:r>
         <w:rPr>
           <w:rFonts w:ascii="Times New Roman" w:hAnsi="Times New Roman" w:cs="Times New Roman"/>
-          <w:b/>
-          <w:bCs/>
         </w:rPr>
         <w:t xml:space="preserve"> se </w:t>
       </w:r>
@@ -1673,8 +1596,6 @@
       <w:r>
         <w:rPr>
           <w:rFonts w:ascii="Times New Roman" w:hAnsi="Times New Roman" w:cs="Times New Roman"/>
-          <w:b/>
-          <w:bCs/>
         </w:rPr>
         <w:t>comunică</w:t>
       </w:r>
@@ -1682,8 +1603,6 @@
       <w:r>
         <w:rPr>
           <w:rFonts w:ascii="Times New Roman" w:hAnsi="Times New Roman" w:cs="Times New Roman"/>
-          <w:b/>
-          <w:bCs/>
         </w:rPr>
         <w:t xml:space="preserve"> </w:t>
       </w:r>
@@ -1691,8 +1610,6 @@
       <w:r>
         <w:rPr>
           <w:rFonts w:ascii="Times New Roman" w:hAnsi="Times New Roman" w:cs="Times New Roman"/>
-          <w:b/>
-          <w:bCs/>
         </w:rPr>
         <w:t>către</w:t>
       </w:r>
@@ -1700,8 +1617,6 @@
       <w:r>
         <w:rPr>
           <w:rFonts w:ascii="Times New Roman" w:hAnsi="Times New Roman" w:cs="Times New Roman"/>
-          <w:b/>
-          <w:bCs/>
         </w:rPr>
         <w:t xml:space="preserve">: {% for </w:t>
       </w:r>
@@ -1709,8 +1624,6 @@
       <w:r>
         <w:rPr>
           <w:rFonts w:ascii="Times New Roman" w:hAnsi="Times New Roman" w:cs="Times New Roman"/>
-          <w:b/>
-          <w:bCs/>
         </w:rPr>
         <w:t>persoana</w:t>
       </w:r>
@@ -1718,8 +1631,6 @@
       <w:r>
         <w:rPr>
           <w:rFonts w:ascii="Times New Roman" w:hAnsi="Times New Roman" w:cs="Times New Roman"/>
-          <w:b/>
-          <w:bCs/>
         </w:rPr>
         <w:t xml:space="preserve"> in </w:t>
       </w:r>
@@ -1727,8 +1638,6 @@
       <w:r>
         <w:rPr>
           <w:rFonts w:ascii="Times New Roman" w:hAnsi="Times New Roman" w:cs="Times New Roman"/>
-          <w:b/>
-          <w:bCs/>
         </w:rPr>
         <w:t>lista_comunicare</w:t>
       </w:r>
@@ -1736,8 +1645,6 @@
       <w:r>
         <w:rPr>
           <w:rFonts w:ascii="Times New Roman" w:hAnsi="Times New Roman" w:cs="Times New Roman"/>
-          <w:b/>
-          <w:bCs/>
         </w:rPr>
         <w:t xml:space="preserve"> %}</w:t>
       </w:r>
@@ -1748,18 +1655,16 @@
           <w:ilvl w:val="0"/>
           <w:numId w:val="4"/>
         </w:numPr>
-        <w:rPr>
-          <w:rFonts w:ascii="Times New Roman" w:hAnsi="Times New Roman" w:cs="Times New Roman"/>
-          <w:b/>
-          <w:bCs/>
+        <w:spacing w:line="240" w:lineRule="auto"/>
+        <w:jc w:val="both"/>
+        <w:rPr>
+          <w:rFonts w:ascii="Times New Roman" w:hAnsi="Times New Roman" w:cs="Times New Roman"/>
         </w:rPr>
       </w:pPr>
       <w:proofErr w:type="gramStart"/>
       <w:r>
         <w:rPr>
           <w:rFonts w:ascii="Times New Roman" w:hAnsi="Times New Roman" w:cs="Times New Roman"/>
-          <w:b/>
-          <w:bCs/>
         </w:rPr>
         <w:t xml:space="preserve">{{ </w:t>
       </w:r>
@@ -1767,8 +1672,6 @@
       <w:r>
         <w:rPr>
           <w:rFonts w:ascii="Times New Roman" w:hAnsi="Times New Roman" w:cs="Times New Roman"/>
-          <w:b/>
-          <w:bCs/>
         </w:rPr>
         <w:t>persoana</w:t>
       </w:r>
@@ -1776,8 +1679,6 @@
       <w:r>
         <w:rPr>
           <w:rFonts w:ascii="Times New Roman" w:hAnsi="Times New Roman" w:cs="Times New Roman"/>
-          <w:b/>
-          <w:bCs/>
         </w:rPr>
         <w:t>.nume_</w:t>
       </w:r>
@@ -1785,8 +1686,6 @@
       <w:r>
         <w:rPr>
           <w:rFonts w:ascii="Times New Roman" w:hAnsi="Times New Roman" w:cs="Times New Roman"/>
-          <w:b/>
-          <w:bCs/>
         </w:rPr>
         <w:t>complet</w:t>
       </w:r>
@@ -1794,8 +1693,6 @@
       <w:r>
         <w:rPr>
           <w:rFonts w:ascii="Times New Roman" w:hAnsi="Times New Roman" w:cs="Times New Roman"/>
-          <w:b/>
-          <w:bCs/>
         </w:rPr>
         <w:t xml:space="preserve"> }</w:t>
       </w:r>
@@ -1803,8 +1700,6 @@
       <w:r>
         <w:rPr>
           <w:rFonts w:ascii="Times New Roman" w:hAnsi="Times New Roman" w:cs="Times New Roman"/>
-          <w:b/>
-          <w:bCs/>
         </w:rPr>
         <w:t xml:space="preserve">} {% </w:t>
       </w:r>
@@ -1812,8 +1707,6 @@
       <w:r>
         <w:rPr>
           <w:rFonts w:ascii="Times New Roman" w:hAnsi="Times New Roman" w:cs="Times New Roman"/>
-          <w:b/>
-          <w:bCs/>
         </w:rPr>
         <w:t>endfor</w:t>
       </w:r>
@@ -1821,15 +1714,15 @@
       <w:r>
         <w:rPr>
           <w:rFonts w:ascii="Times New Roman" w:hAnsi="Times New Roman" w:cs="Times New Roman"/>
-          <w:b/>
-          <w:bCs/>
         </w:rPr>
         <w:t xml:space="preserve"> %}</w:t>
       </w:r>
     </w:p>
     <w:p>
       <w:pPr>
+        <w:spacing w:line="240" w:lineRule="auto"/>
         <w:ind w:left="720"/>
+        <w:jc w:val="both"/>
         <w:rPr>
           <w:rFonts w:ascii="Times New Roman" w:hAnsi="Times New Roman" w:cs="Times New Roman"/>
           <w:b/>
@@ -1839,6 +1732,7 @@
     </w:p>
     <w:p>
       <w:pPr>
+        <w:spacing w:line="240" w:lineRule="auto"/>
         <w:jc w:val="center"/>
         <w:rPr>
           <w:rFonts w:ascii="Times New Roman" w:hAnsi="Times New Roman" w:cs="Times New Roman"/>
@@ -1903,6 +1797,7 @@
     </w:p>
     <w:p>
       <w:pPr>
+        <w:spacing w:line="240" w:lineRule="auto"/>
         <w:jc w:val="center"/>
         <w:rPr>
           <w:rFonts w:ascii="Times New Roman" w:hAnsi="Times New Roman" w:cs="Times New Roman"/>
@@ -1965,10 +1860,16 @@
         <w:t>}</w:t>
       </w:r>
     </w:p>
-    <w:p/>
+    <w:p>
+      <w:pPr>
+        <w:spacing w:line="240" w:lineRule="auto"/>
+        <w:jc w:val="both"/>
+      </w:pPr>
+    </w:p>
     <w:sectPr>
-      <w:pgSz w:w="12240" w:h="15840"/>
-      <w:pgMar w:top="1440" w:right="1440" w:bottom="1440" w:left="1440" w:header="720" w:footer="720" w:gutter="0"/>
+      <w:type w:val="continuous"/>
+      <w:pgSz w:w="11906" w:h="16838" w:code="9"/>
+      <w:pgMar w:top="1440" w:right="1080" w:bottom="1440" w:left="1080" w:header="720" w:footer="720" w:gutter="0"/>
       <w:cols w:space="720"/>
       <w:docGrid w:linePitch="360"/>
     </w:sectPr>
@@ -3061,6 +2962,7 @@
   <w:style w:type="character" w:default="1" w:styleId="DefaultParagraphFont">
     <w:name w:val="Default Paragraph Font"/>
     <w:uiPriority w:val="1"/>
+    <w:semiHidden/>
     <w:unhideWhenUsed/>
   </w:style>
   <w:style w:type="table" w:default="1" w:styleId="TableNormal">

</xml_diff>